<commit_message>
Add interactive field mapping with auto-detection, bidirectional geographic auto-completion, editable PDF form fields, and comprehensive documentation
</commit_message>
<xml_diff>
--- a/Docs/plantilla_domiciliacion_sepa.docx
+++ b/Docs/plantilla_domiciliacion_sepa.docx
@@ -236,6 +236,7 @@
                                 <w:sz w:val="13"/>
                               </w:rPr>
                             </w:pPr>
+                            <w:proofErr w:type="spellStart"/>
                             <w:r>
                               <w:rPr>
                                 <w:color w:val="1F487C"/>
@@ -244,6 +245,7 @@
                               </w:rPr>
                               <w:t>To</w:t>
                             </w:r>
+                            <w:proofErr w:type="spellEnd"/>
                             <w:r>
                               <w:rPr>
                                 <w:color w:val="1F487C"/>
@@ -270,6 +272,7 @@
                               </w:rPr>
                               <w:t xml:space="preserve"> </w:t>
                             </w:r>
+                            <w:proofErr w:type="spellStart"/>
                             <w:r>
                               <w:rPr>
                                 <w:color w:val="1F487C"/>
@@ -278,6 +281,7 @@
                               </w:rPr>
                               <w:t>completed</w:t>
                             </w:r>
+                            <w:proofErr w:type="spellEnd"/>
                             <w:r>
                               <w:rPr>
                                 <w:color w:val="1F487C"/>
@@ -287,6 +291,7 @@
                               </w:rPr>
                               <w:t xml:space="preserve"> </w:t>
                             </w:r>
+                            <w:proofErr w:type="spellStart"/>
                             <w:r>
                               <w:rPr>
                                 <w:color w:val="1F487C"/>
@@ -295,6 +300,7 @@
                               </w:rPr>
                               <w:t>by</w:t>
                             </w:r>
+                            <w:proofErr w:type="spellEnd"/>
                             <w:r>
                               <w:rPr>
                                 <w:color w:val="1F487C"/>
@@ -304,6 +310,7 @@
                               </w:rPr>
                               <w:t xml:space="preserve"> </w:t>
                             </w:r>
+                            <w:proofErr w:type="spellStart"/>
                             <w:r>
                               <w:rPr>
                                 <w:color w:val="1F487C"/>
@@ -312,6 +319,7 @@
                               </w:rPr>
                               <w:t>the</w:t>
                             </w:r>
+                            <w:proofErr w:type="spellEnd"/>
                             <w:r>
                               <w:rPr>
                                 <w:color w:val="1F487C"/>
@@ -321,6 +329,7 @@
                               </w:rPr>
                               <w:t xml:space="preserve"> </w:t>
                             </w:r>
+                            <w:proofErr w:type="spellStart"/>
                             <w:r>
                               <w:rPr>
                                 <w:color w:val="1F487C"/>
@@ -329,6 +338,7 @@
                               </w:rPr>
                               <w:t>debtor</w:t>
                             </w:r>
+                            <w:proofErr w:type="spellEnd"/>
                           </w:p>
                         </w:txbxContent>
                       </wps:txbx>
@@ -661,6 +671,7 @@
         </w:rPr>
         <w:t xml:space="preserve"> </w:t>
       </w:r>
+      <w:proofErr w:type="spellStart"/>
       <w:r>
         <w:rPr>
           <w:i/>
@@ -668,6 +679,7 @@
         </w:rPr>
         <w:t>Debit</w:t>
       </w:r>
+      <w:proofErr w:type="spellEnd"/>
       <w:r>
         <w:rPr>
           <w:i/>
@@ -961,6 +973,7 @@
                                 <w:sz w:val="13"/>
                               </w:rPr>
                             </w:pPr>
+                            <w:proofErr w:type="spellStart"/>
                             <w:r>
                               <w:rPr>
                                 <w:color w:val="1F487C"/>
@@ -969,6 +982,7 @@
                               </w:rPr>
                               <w:t>To</w:t>
                             </w:r>
+                            <w:proofErr w:type="spellEnd"/>
                             <w:r>
                               <w:rPr>
                                 <w:color w:val="1F487C"/>
@@ -995,6 +1009,7 @@
                               </w:rPr>
                               <w:t xml:space="preserve"> </w:t>
                             </w:r>
+                            <w:proofErr w:type="spellStart"/>
                             <w:r>
                               <w:rPr>
                                 <w:color w:val="1F487C"/>
@@ -1003,6 +1018,7 @@
                               </w:rPr>
                               <w:t>completed</w:t>
                             </w:r>
+                            <w:proofErr w:type="spellEnd"/>
                             <w:r>
                               <w:rPr>
                                 <w:color w:val="1F487C"/>
@@ -1012,6 +1028,7 @@
                               </w:rPr>
                               <w:t xml:space="preserve"> </w:t>
                             </w:r>
+                            <w:proofErr w:type="spellStart"/>
                             <w:r>
                               <w:rPr>
                                 <w:color w:val="1F487C"/>
@@ -1020,6 +1037,7 @@
                               </w:rPr>
                               <w:t>by</w:t>
                             </w:r>
+                            <w:proofErr w:type="spellEnd"/>
                             <w:r>
                               <w:rPr>
                                 <w:color w:val="1F487C"/>
@@ -1029,6 +1047,7 @@
                               </w:rPr>
                               <w:t xml:space="preserve"> </w:t>
                             </w:r>
+                            <w:proofErr w:type="spellStart"/>
                             <w:r>
                               <w:rPr>
                                 <w:color w:val="1F487C"/>
@@ -1037,6 +1056,7 @@
                               </w:rPr>
                               <w:t>the</w:t>
                             </w:r>
+                            <w:proofErr w:type="spellEnd"/>
                             <w:r>
                               <w:rPr>
                                 <w:color w:val="1F487C"/>
@@ -1046,6 +1066,7 @@
                               </w:rPr>
                               <w:t xml:space="preserve"> </w:t>
                             </w:r>
+                            <w:proofErr w:type="spellStart"/>
                             <w:r>
                               <w:rPr>
                                 <w:color w:val="1F487C"/>
@@ -1054,6 +1075,7 @@
                               </w:rPr>
                               <w:t>creditor</w:t>
                             </w:r>
+                            <w:proofErr w:type="spellEnd"/>
                           </w:p>
                         </w:txbxContent>
                       </wps:txbx>
@@ -1391,7 +1413,16 @@
           <w:i/>
           <w:sz w:val="19"/>
         </w:rPr>
-        <w:t xml:space="preserve">domiciliación:   </w:t>
+        <w:t xml:space="preserve">domiciliación: </w:t>
+      </w:r>
+      <w:proofErr w:type="gramStart"/>
+      <w:r>
+        <w:rPr>
+          <w:b/>
+          <w:i/>
+          <w:sz w:val="19"/>
+        </w:rPr>
+        <w:t xml:space="preserve">  </w:t>
       </w:r>
       <w:r>
         <w:rPr>
@@ -1409,7 +1440,37 @@
           <w:spacing w:val="16"/>
           <w:sz w:val="19"/>
         </w:rPr>
-        <w:t>{{referencia_orden}}</w:t>
+        <w:t>{</w:t>
+      </w:r>
+      <w:proofErr w:type="gramEnd"/>
+      <w:r>
+        <w:rPr>
+          <w:b/>
+          <w:i/>
+          <w:spacing w:val="16"/>
+          <w:sz w:val="19"/>
+        </w:rPr>
+        <w:t>{</w:t>
+      </w:r>
+      <w:proofErr w:type="spellStart"/>
+      <w:r>
+        <w:rPr>
+          <w:b/>
+          <w:i/>
+          <w:spacing w:val="16"/>
+          <w:sz w:val="19"/>
+        </w:rPr>
+        <w:t>referencia_orden</w:t>
+      </w:r>
+      <w:proofErr w:type="spellEnd"/>
+      <w:r>
+        <w:rPr>
+          <w:b/>
+          <w:i/>
+          <w:spacing w:val="16"/>
+          <w:sz w:val="19"/>
+        </w:rPr>
+        <w:t>}}</w:t>
       </w:r>
     </w:p>
     <w:p>
@@ -1446,7 +1507,16 @@
           <w:i/>
           <w:sz w:val="19"/>
         </w:rPr>
-        <w:t xml:space="preserve">acreedor     </w:t>
+        <w:t xml:space="preserve">acreedor    </w:t>
+      </w:r>
+      <w:proofErr w:type="gramStart"/>
+      <w:r>
+        <w:rPr>
+          <w:b/>
+          <w:i/>
+          <w:sz w:val="19"/>
+        </w:rPr>
+        <w:t xml:space="preserve"> </w:t>
       </w:r>
       <w:r>
         <w:rPr>
@@ -1465,22 +1535,43 @@
         </w:rPr>
         <w:t>:</w:t>
       </w:r>
-      <w:r>
-        <w:rPr>
-          <w:b/>
-          <w:i/>
-          <w:sz w:val="19"/>
-        </w:rPr>
-        <w:t xml:space="preserve"> </w:t>
-      </w:r>
+      <w:proofErr w:type="gramEnd"/>
+      <w:r>
+        <w:rPr>
+          <w:b/>
+          <w:i/>
+          <w:sz w:val="19"/>
+        </w:rPr>
+        <w:t xml:space="preserve"> </w:t>
+      </w:r>
+      <w:proofErr w:type="spellStart"/>
       <w:r>
         <w:rPr>
           <w:bCs/>
           <w:iCs/>
           <w:sz w:val="19"/>
         </w:rPr>
-        <w:t>Gfg Kids</w:t>
-      </w:r>
+        <w:t>Gfg</w:t>
+      </w:r>
+      <w:proofErr w:type="spellEnd"/>
+      <w:r>
+        <w:rPr>
+          <w:bCs/>
+          <w:iCs/>
+          <w:sz w:val="19"/>
+        </w:rPr>
+        <w:t xml:space="preserve"> </w:t>
+      </w:r>
+      <w:proofErr w:type="spellStart"/>
+      <w:r>
+        <w:rPr>
+          <w:bCs/>
+          <w:iCs/>
+          <w:sz w:val="19"/>
+        </w:rPr>
+        <w:t>Kids</w:t>
+      </w:r>
+      <w:proofErr w:type="spellEnd"/>
     </w:p>
     <w:p>
       <w:pPr>
@@ -1492,6 +1583,7 @@
           <w:sz w:val="12"/>
         </w:rPr>
       </w:pPr>
+      <w:proofErr w:type="spellStart"/>
       <w:r>
         <w:rPr>
           <w:b/>
@@ -1501,6 +1593,7 @@
         </w:rPr>
         <w:t>Creditor</w:t>
       </w:r>
+      <w:proofErr w:type="spellEnd"/>
       <w:r>
         <w:rPr>
           <w:b/>
@@ -1510,6 +1603,7 @@
         </w:rPr>
         <w:t xml:space="preserve"> </w:t>
       </w:r>
+      <w:proofErr w:type="spellStart"/>
       <w:r>
         <w:rPr>
           <w:b/>
@@ -1518,6 +1612,7 @@
         </w:rPr>
         <w:t>Identifier</w:t>
       </w:r>
+      <w:proofErr w:type="spellEnd"/>
     </w:p>
     <w:p>
       <w:pPr>
@@ -1597,6 +1692,7 @@
         </w:rPr>
         <w:t xml:space="preserve"> </w:t>
       </w:r>
+      <w:proofErr w:type="spellStart"/>
       <w:r>
         <w:rPr>
           <w:b/>
@@ -1605,6 +1701,7 @@
         </w:rPr>
         <w:t>Creditor´s</w:t>
       </w:r>
+      <w:proofErr w:type="spellEnd"/>
       <w:r>
         <w:rPr>
           <w:b/>
@@ -1614,6 +1711,7 @@
         </w:rPr>
         <w:t xml:space="preserve"> </w:t>
       </w:r>
+      <w:proofErr w:type="spellStart"/>
       <w:r>
         <w:rPr>
           <w:b/>
@@ -1622,6 +1720,7 @@
         </w:rPr>
         <w:t>name</w:t>
       </w:r>
+      <w:proofErr w:type="spellEnd"/>
     </w:p>
     <w:p>
       <w:pPr>
@@ -1633,13 +1732,23 @@
           <w:sz w:val="19"/>
         </w:rPr>
       </w:pPr>
+      <w:proofErr w:type="gramStart"/>
       <w:r>
         <w:rPr>
           <w:bCs/>
           <w:iCs/>
           <w:sz w:val="19"/>
         </w:rPr>
-        <w:t xml:space="preserve">Isabel  García </w:t>
+        <w:t>Isabel  García</w:t>
+      </w:r>
+      <w:proofErr w:type="gramEnd"/>
+      <w:r>
+        <w:rPr>
+          <w:bCs/>
+          <w:iCs/>
+          <w:sz w:val="19"/>
+        </w:rPr>
+        <w:t xml:space="preserve"> </w:t>
       </w:r>
       <w:r>
         <w:rPr>
@@ -1703,6 +1812,7 @@
         </w:rPr>
         <w:t xml:space="preserve"> </w:t>
       </w:r>
+      <w:proofErr w:type="spellStart"/>
       <w:r>
         <w:rPr>
           <w:b/>
@@ -1711,6 +1821,7 @@
         </w:rPr>
         <w:t>Address</w:t>
       </w:r>
+      <w:proofErr w:type="spellEnd"/>
     </w:p>
     <w:p>
       <w:pPr>
@@ -3052,7 +3163,43 @@
           <w:sz w:val="12"/>
           <w:lang w:val="en-US"/>
         </w:rPr>
-        <w:t>By signing this mandate form, you au thorise (A) the Creditor to send instructions to your bank to debit your account and (B) your bank to debit your account in accordance with the instructions from the</w:t>
+        <w:t xml:space="preserve">By signing this mandate form, </w:t>
+      </w:r>
+      <w:proofErr w:type="gramStart"/>
+      <w:r>
+        <w:rPr>
+          <w:i/>
+          <w:sz w:val="12"/>
+          <w:lang w:val="en-US"/>
+        </w:rPr>
+        <w:t>you</w:t>
+      </w:r>
+      <w:proofErr w:type="gramEnd"/>
+      <w:r>
+        <w:rPr>
+          <w:i/>
+          <w:sz w:val="12"/>
+          <w:lang w:val="en-US"/>
+        </w:rPr>
+        <w:t xml:space="preserve"> au </w:t>
+      </w:r>
+      <w:proofErr w:type="spellStart"/>
+      <w:r>
+        <w:rPr>
+          <w:i/>
+          <w:sz w:val="12"/>
+          <w:lang w:val="en-US"/>
+        </w:rPr>
+        <w:t>thorise</w:t>
+      </w:r>
+      <w:proofErr w:type="spellEnd"/>
+      <w:r>
+        <w:rPr>
+          <w:i/>
+          <w:sz w:val="12"/>
+          <w:lang w:val="en-US"/>
+        </w:rPr>
+        <w:t xml:space="preserve"> (A) the Creditor to send instructions to your bank to debit your account and (B) your bank to debit your account in accordance with the instructions from the</w:t>
       </w:r>
       <w:r>
         <w:rPr>
@@ -3637,6 +3784,7 @@
         </w:rPr>
         <w:t xml:space="preserve"> </w:t>
       </w:r>
+      <w:proofErr w:type="spellStart"/>
       <w:r>
         <w:rPr>
           <w:i/>
@@ -3646,6 +3794,7 @@
         </w:rPr>
         <w:t>eigth</w:t>
       </w:r>
+      <w:proofErr w:type="spellEnd"/>
       <w:r>
         <w:rPr>
           <w:i/>
@@ -4252,6 +4401,7 @@
         </w:rPr>
         <w:t xml:space="preserve"> </w:t>
       </w:r>
+      <w:proofErr w:type="spellStart"/>
       <w:r>
         <w:rPr>
           <w:b/>
@@ -4260,6 +4410,7 @@
         </w:rPr>
         <w:t>Debtor’s</w:t>
       </w:r>
+      <w:proofErr w:type="spellEnd"/>
       <w:r>
         <w:rPr>
           <w:b/>
@@ -4269,6 +4420,7 @@
         </w:rPr>
         <w:t xml:space="preserve"> </w:t>
       </w:r>
+      <w:proofErr w:type="spellStart"/>
       <w:r>
         <w:rPr>
           <w:b/>
@@ -4277,6 +4429,7 @@
         </w:rPr>
         <w:t>name</w:t>
       </w:r>
+      <w:proofErr w:type="spellEnd"/>
       <w:r>
         <w:rPr>
           <w:b/>
@@ -4380,7 +4533,25 @@
           <w:iCs/>
           <w:sz w:val="19"/>
         </w:rPr>
-        <w:t>{{nombre_deudor}}</w:t>
+        <w:t>{{</w:t>
+      </w:r>
+      <w:proofErr w:type="spellStart"/>
+      <w:r>
+        <w:rPr>
+          <w:bCs/>
+          <w:iCs/>
+          <w:sz w:val="19"/>
+        </w:rPr>
+        <w:t>nombre_deudor</w:t>
+      </w:r>
+      <w:proofErr w:type="spellEnd"/>
+      <w:r>
+        <w:rPr>
+          <w:bCs/>
+          <w:iCs/>
+          <w:sz w:val="19"/>
+        </w:rPr>
+        <w:t>}}</w:t>
       </w:r>
     </w:p>
     <w:p>
@@ -4451,6 +4622,7 @@
         </w:rPr>
         <w:t>/</w:t>
       </w:r>
+      <w:proofErr w:type="spellStart"/>
       <w:r>
         <w:rPr>
           <w:b/>
@@ -4459,6 +4631,7 @@
         </w:rPr>
         <w:t>Address</w:t>
       </w:r>
+      <w:proofErr w:type="spellEnd"/>
       <w:r>
         <w:rPr>
           <w:b/>
@@ -4468,6 +4641,7 @@
         </w:rPr>
         <w:t xml:space="preserve"> </w:t>
       </w:r>
+      <w:proofErr w:type="spellStart"/>
       <w:r>
         <w:rPr>
           <w:b/>
@@ -4476,6 +4650,7 @@
         </w:rPr>
         <w:t>of</w:t>
       </w:r>
+      <w:proofErr w:type="spellEnd"/>
       <w:r>
         <w:rPr>
           <w:b/>
@@ -4485,6 +4660,7 @@
         </w:rPr>
         <w:t xml:space="preserve"> </w:t>
       </w:r>
+      <w:proofErr w:type="spellStart"/>
       <w:r>
         <w:rPr>
           <w:b/>
@@ -4493,6 +4669,7 @@
         </w:rPr>
         <w:t>the</w:t>
       </w:r>
+      <w:proofErr w:type="spellEnd"/>
       <w:r>
         <w:rPr>
           <w:b/>
@@ -4502,6 +4679,7 @@
         </w:rPr>
         <w:t xml:space="preserve"> </w:t>
       </w:r>
+      <w:proofErr w:type="spellStart"/>
       <w:r>
         <w:rPr>
           <w:b/>
@@ -4510,6 +4688,7 @@
         </w:rPr>
         <w:t>debtor</w:t>
       </w:r>
+      <w:proofErr w:type="spellEnd"/>
     </w:p>
     <w:p>
       <w:pPr>
@@ -4529,7 +4708,27 @@
           <w:sz w:val="19"/>
           <w:u w:val="single"/>
         </w:rPr>
-        <w:t>{{direccion_deudor}}</w:t>
+        <w:t>{{</w:t>
+      </w:r>
+      <w:proofErr w:type="spellStart"/>
+      <w:r>
+        <w:rPr>
+          <w:bCs/>
+          <w:iCs/>
+          <w:sz w:val="19"/>
+          <w:u w:val="single"/>
+        </w:rPr>
+        <w:t>direccion_deudor</w:t>
+      </w:r>
+      <w:proofErr w:type="spellEnd"/>
+      <w:r>
+        <w:rPr>
+          <w:bCs/>
+          <w:iCs/>
+          <w:sz w:val="19"/>
+          <w:u w:val="single"/>
+        </w:rPr>
+        <w:t>}}</w:t>
       </w:r>
     </w:p>
     <w:p>
@@ -4772,23 +4971,26 @@
           <w:iCs/>
           <w:sz w:val="19"/>
         </w:rPr>
-        <w:t>{{codigo_postal}}</w:t>
-      </w:r>
+        <w:t>{{</w:t>
+      </w:r>
+      <w:proofErr w:type="spellStart"/>
       <w:r>
         <w:rPr>
           <w:bCs/>
           <w:iCs/>
           <w:sz w:val="19"/>
         </w:rPr>
-        <w:t xml:space="preserve">  </w:t>
-      </w:r>
+        <w:t>codigo_postal</w:t>
+      </w:r>
+      <w:proofErr w:type="spellEnd"/>
+      <w:proofErr w:type="gramStart"/>
       <w:r>
         <w:rPr>
           <w:bCs/>
           <w:iCs/>
           <w:sz w:val="19"/>
         </w:rPr>
-        <w:t>{{poblacion}}</w:t>
+        <w:t>}}</w:t>
       </w:r>
       <w:r>
         <w:rPr>
@@ -4804,7 +5006,60 @@
           <w:iCs/>
           <w:sz w:val="19"/>
         </w:rPr>
-        <w:t>{{provincia}}</w:t>
+        <w:t>{</w:t>
+      </w:r>
+      <w:proofErr w:type="gramEnd"/>
+      <w:r>
+        <w:rPr>
+          <w:bCs/>
+          <w:iCs/>
+          <w:sz w:val="19"/>
+        </w:rPr>
+        <w:t>{</w:t>
+      </w:r>
+      <w:proofErr w:type="spellStart"/>
+      <w:r>
+        <w:rPr>
+          <w:bCs/>
+          <w:iCs/>
+          <w:sz w:val="19"/>
+        </w:rPr>
+        <w:t>poblacion</w:t>
+      </w:r>
+      <w:proofErr w:type="spellEnd"/>
+      <w:proofErr w:type="gramStart"/>
+      <w:r>
+        <w:rPr>
+          <w:bCs/>
+          <w:iCs/>
+          <w:sz w:val="19"/>
+        </w:rPr>
+        <w:t>}}</w:t>
+      </w:r>
+      <w:r>
+        <w:rPr>
+          <w:bCs/>
+          <w:iCs/>
+          <w:sz w:val="19"/>
+        </w:rPr>
+        <w:t xml:space="preserve">  </w:t>
+      </w:r>
+      <w:r>
+        <w:rPr>
+          <w:bCs/>
+          <w:iCs/>
+          <w:sz w:val="19"/>
+        </w:rPr>
+        <w:t>{</w:t>
+      </w:r>
+      <w:proofErr w:type="gramEnd"/>
+      <w:r>
+        <w:rPr>
+          <w:bCs/>
+          <w:iCs/>
+          <w:sz w:val="19"/>
+        </w:rPr>
+        <w:t>{provincia}}</w:t>
       </w:r>
     </w:p>
     <w:p>
@@ -4900,6 +5155,7 @@
         </w:rPr>
         <w:t xml:space="preserve"> </w:t>
       </w:r>
+      <w:proofErr w:type="spellStart"/>
       <w:r>
         <w:rPr>
           <w:b/>
@@ -4908,6 +5164,7 @@
         </w:rPr>
         <w:t>of</w:t>
       </w:r>
+      <w:proofErr w:type="spellEnd"/>
       <w:r>
         <w:rPr>
           <w:b/>
@@ -4917,6 +5174,7 @@
         </w:rPr>
         <w:t xml:space="preserve"> </w:t>
       </w:r>
+      <w:proofErr w:type="spellStart"/>
       <w:r>
         <w:rPr>
           <w:b/>
@@ -4925,6 +5183,7 @@
         </w:rPr>
         <w:t>the</w:t>
       </w:r>
+      <w:proofErr w:type="spellEnd"/>
       <w:r>
         <w:rPr>
           <w:b/>
@@ -4934,6 +5193,7 @@
         </w:rPr>
         <w:t xml:space="preserve"> </w:t>
       </w:r>
+      <w:proofErr w:type="spellStart"/>
       <w:r>
         <w:rPr>
           <w:b/>
@@ -4942,6 +5202,7 @@
         </w:rPr>
         <w:t>debtor</w:t>
       </w:r>
+      <w:proofErr w:type="spellEnd"/>
     </w:p>
     <w:p>
       <w:pPr>
@@ -4962,7 +5223,27 @@
           <w:sz w:val="19"/>
           <w:lang w:val="en-US"/>
         </w:rPr>
-        <w:t>{{pais_deudor}}</w:t>
+        <w:t>{{</w:t>
+      </w:r>
+      <w:proofErr w:type="spellStart"/>
+      <w:r>
+        <w:rPr>
+          <w:bCs/>
+          <w:iCs/>
+          <w:sz w:val="19"/>
+          <w:lang w:val="en-US"/>
+        </w:rPr>
+        <w:t>pais_deudor</w:t>
+      </w:r>
+      <w:proofErr w:type="spellEnd"/>
+      <w:r>
+        <w:rPr>
+          <w:bCs/>
+          <w:iCs/>
+          <w:sz w:val="19"/>
+          <w:lang w:val="en-US"/>
+        </w:rPr>
+        <w:t>}}</w:t>
       </w:r>
     </w:p>
     <w:p>
@@ -5095,8 +5376,39 @@
           <w:sz w:val="12"/>
           <w:lang w:val="en-US"/>
         </w:rPr>
-        <w:t>(puede contener</w:t>
-      </w:r>
+        <w:t>(</w:t>
+      </w:r>
+      <w:proofErr w:type="spellStart"/>
+      <w:r>
+        <w:rPr>
+          <w:b/>
+          <w:i/>
+          <w:sz w:val="12"/>
+          <w:lang w:val="en-US"/>
+        </w:rPr>
+        <w:t>puede</w:t>
+      </w:r>
+      <w:proofErr w:type="spellEnd"/>
+      <w:r>
+        <w:rPr>
+          <w:b/>
+          <w:i/>
+          <w:sz w:val="12"/>
+          <w:lang w:val="en-US"/>
+        </w:rPr>
+        <w:t xml:space="preserve"> </w:t>
+      </w:r>
+      <w:proofErr w:type="spellStart"/>
+      <w:r>
+        <w:rPr>
+          <w:b/>
+          <w:i/>
+          <w:sz w:val="12"/>
+          <w:lang w:val="en-US"/>
+        </w:rPr>
+        <w:t>contener</w:t>
+      </w:r>
+      <w:proofErr w:type="spellEnd"/>
       <w:r>
         <w:rPr>
           <w:b/>
@@ -5114,7 +5426,27 @@
           <w:sz w:val="12"/>
           <w:lang w:val="en-US"/>
         </w:rPr>
-        <w:t>8 u 11 posiciones) / Swift BIC (up</w:t>
+        <w:t xml:space="preserve">8 u 11 </w:t>
+      </w:r>
+      <w:proofErr w:type="spellStart"/>
+      <w:r>
+        <w:rPr>
+          <w:b/>
+          <w:i/>
+          <w:sz w:val="12"/>
+          <w:lang w:val="en-US"/>
+        </w:rPr>
+        <w:t>posiciones</w:t>
+      </w:r>
+      <w:proofErr w:type="spellEnd"/>
+      <w:r>
+        <w:rPr>
+          <w:b/>
+          <w:i/>
+          <w:sz w:val="12"/>
+          <w:lang w:val="en-US"/>
+        </w:rPr>
+        <w:t>) / Swift BIC (up</w:t>
       </w:r>
       <w:r>
         <w:rPr>
@@ -5154,7 +5486,27 @@
           <w:sz w:val="19"/>
           <w:u w:val="single"/>
         </w:rPr>
-        <w:t>{{swift_bic}}</w:t>
+        <w:t>{{</w:t>
+      </w:r>
+      <w:proofErr w:type="spellStart"/>
+      <w:r>
+        <w:rPr>
+          <w:bCs/>
+          <w:iCs/>
+          <w:sz w:val="19"/>
+          <w:u w:val="single"/>
+        </w:rPr>
+        <w:t>swift_bic</w:t>
+      </w:r>
+      <w:proofErr w:type="spellEnd"/>
+      <w:r>
+        <w:rPr>
+          <w:bCs/>
+          <w:iCs/>
+          <w:sz w:val="19"/>
+          <w:u w:val="single"/>
+        </w:rPr>
+        <w:t>}}</w:t>
       </w:r>
     </w:p>
     <w:p>
@@ -5269,6 +5621,7 @@
         </w:rPr>
         <w:t xml:space="preserve"> </w:t>
       </w:r>
+      <w:proofErr w:type="spellStart"/>
       <w:r>
         <w:rPr>
           <w:b/>
@@ -5277,6 +5630,7 @@
         </w:rPr>
         <w:t>Account</w:t>
       </w:r>
+      <w:proofErr w:type="spellEnd"/>
       <w:r>
         <w:rPr>
           <w:b/>
@@ -5286,6 +5640,7 @@
         </w:rPr>
         <w:t xml:space="preserve"> </w:t>
       </w:r>
+      <w:proofErr w:type="spellStart"/>
       <w:r>
         <w:rPr>
           <w:b/>
@@ -5294,6 +5649,7 @@
         </w:rPr>
         <w:t>number</w:t>
       </w:r>
+      <w:proofErr w:type="spellEnd"/>
       <w:r>
         <w:rPr>
           <w:b/>
@@ -5492,6 +5848,7 @@
         </w:rPr>
         <w:t xml:space="preserve"> </w:t>
       </w:r>
+      <w:proofErr w:type="spellStart"/>
       <w:r>
         <w:rPr>
           <w:b/>
@@ -5500,6 +5857,7 @@
         </w:rPr>
         <w:t>sie</w:t>
       </w:r>
+      <w:proofErr w:type="spellEnd"/>
       <w:r>
         <w:rPr>
           <w:b/>
@@ -5508,6 +5866,7 @@
         </w:rPr>
         <w:t xml:space="preserve"> </w:t>
       </w:r>
+      <w:proofErr w:type="spellStart"/>
       <w:r>
         <w:rPr>
           <w:b/>
@@ -5516,6 +5875,7 @@
         </w:rPr>
         <w:t>mpre</w:t>
       </w:r>
+      <w:proofErr w:type="spellEnd"/>
       <w:r>
         <w:rPr>
           <w:b/>
@@ -6204,7 +6564,27 @@
           <w:spacing w:val="2"/>
           <w:sz w:val="19"/>
         </w:rPr>
-        <w:t>{{localidad_firma}}</w:t>
+        <w:t>{{</w:t>
+      </w:r>
+      <w:proofErr w:type="spellStart"/>
+      <w:r>
+        <w:rPr>
+          <w:bCs/>
+          <w:iCs/>
+          <w:spacing w:val="2"/>
+          <w:sz w:val="19"/>
+        </w:rPr>
+        <w:t>localidad_firma</w:t>
+      </w:r>
+      <w:proofErr w:type="spellEnd"/>
+      <w:r>
+        <w:rPr>
+          <w:bCs/>
+          <w:iCs/>
+          <w:spacing w:val="2"/>
+          <w:sz w:val="19"/>
+        </w:rPr>
+        <w:t>}}</w:t>
       </w:r>
     </w:p>
     <w:p>
@@ -6225,77 +6605,67 @@
         <w:rPr>
           <w:iCs/>
           <w:sz w:val="20"/>
+        </w:rPr>
+      </w:pPr>
+      <w:r>
+        <w:rPr>
+          <w:b/>
+          <w:i/>
+          <w:sz w:val="19"/>
+        </w:rPr>
+        <w:t xml:space="preserve">Firma      </w:t>
+      </w:r>
+      <w:r>
+        <w:rPr>
+          <w:b/>
+          <w:i/>
+          <w:spacing w:val="34"/>
+          <w:sz w:val="19"/>
+        </w:rPr>
+        <w:t xml:space="preserve"> </w:t>
+      </w:r>
+      <w:r>
+        <w:rPr>
+          <w:b/>
+          <w:i/>
+          <w:sz w:val="19"/>
+        </w:rPr>
+        <w:t xml:space="preserve">del      </w:t>
+      </w:r>
+      <w:r>
+        <w:rPr>
+          <w:b/>
+          <w:i/>
+          <w:spacing w:val="29"/>
+          <w:sz w:val="19"/>
+        </w:rPr>
+        <w:t xml:space="preserve"> </w:t>
+      </w:r>
+      <w:r>
+        <w:rPr>
+          <w:b/>
+          <w:i/>
+          <w:sz w:val="19"/>
+        </w:rPr>
+        <w:t>deudor:</w:t>
+      </w:r>
+      <w:r>
+        <w:rPr>
+          <w:b/>
+          <w:i/>
+          <w:sz w:val="19"/>
+        </w:rPr>
+        <w:t xml:space="preserve">  </w:t>
+      </w:r>
+      <w:r>
+        <w:rPr>
+          <w:b/>
+          <w:i/>
+          <w:sz w:val="19"/>
           <w:u w:val="single"/>
         </w:rPr>
-      </w:pPr>
-      <w:r>
-        <w:rPr>
-          <w:b/>
-          <w:i/>
-          <w:sz w:val="19"/>
-        </w:rPr>
-        <w:t xml:space="preserve">Firma      </w:t>
-      </w:r>
-      <w:r>
-        <w:rPr>
-          <w:b/>
-          <w:i/>
-          <w:spacing w:val="34"/>
-          <w:sz w:val="19"/>
-        </w:rPr>
-        <w:t xml:space="preserve"> </w:t>
-      </w:r>
-      <w:r>
-        <w:rPr>
-          <w:b/>
-          <w:i/>
-          <w:sz w:val="19"/>
-        </w:rPr>
-        <w:t xml:space="preserve">del      </w:t>
-      </w:r>
-      <w:r>
-        <w:rPr>
-          <w:b/>
-          <w:i/>
-          <w:spacing w:val="29"/>
-          <w:sz w:val="19"/>
-        </w:rPr>
-        <w:t xml:space="preserve"> </w:t>
-      </w:r>
-      <w:r>
-        <w:rPr>
-          <w:b/>
-          <w:i/>
-          <w:sz w:val="19"/>
-        </w:rPr>
-        <w:t>deudor:</w:t>
-      </w:r>
-      <w:r>
-        <w:rPr>
-          <w:b/>
-          <w:i/>
-          <w:sz w:val="19"/>
-        </w:rPr>
-        <w:t xml:space="preserve">  </w:t>
-      </w:r>
-      <w:r>
-        <w:rPr>
-          <w:b/>
-          <w:i/>
-          <w:sz w:val="19"/>
-          <w:u w:val="single"/>
-        </w:rPr>
         <w:t xml:space="preserve">                                                                                                                                     </w:t>
       </w:r>
-    </w:p>
-    <w:p>
-      <w:pPr>
-        <w:ind w:left="567"/>
-        <w:rPr>
-          <w:iCs/>
-          <w:sz w:val="20"/>
-        </w:rPr>
-      </w:pPr>
     </w:p>
     <w:p>
       <w:pPr>
@@ -6322,265 +6692,6 @@
           <w:sz w:val="27"/>
         </w:rPr>
       </w:pPr>
-    </w:p>
-    <w:p>
-      <w:pPr>
-        <w:pStyle w:val="Textoindependiente"/>
-        <w:spacing w:before="97"/>
-        <w:ind w:left="1177" w:right="1096"/>
-        <w:jc w:val="center"/>
-      </w:pPr>
-      <w:r>
-        <w:t>TODOS</w:t>
-      </w:r>
-      <w:r>
-        <w:rPr>
-          <w:spacing w:val="-7"/>
-        </w:rPr>
-        <w:t xml:space="preserve"> </w:t>
-      </w:r>
-      <w:r>
-        <w:t>LOS</w:t>
-      </w:r>
-      <w:r>
-        <w:rPr>
-          <w:spacing w:val="-6"/>
-        </w:rPr>
-        <w:t xml:space="preserve"> </w:t>
-      </w:r>
-      <w:r>
-        <w:t>CAMPOS</w:t>
-      </w:r>
-      <w:r>
-        <w:rPr>
-          <w:spacing w:val="-7"/>
-        </w:rPr>
-        <w:t xml:space="preserve"> </w:t>
-      </w:r>
-      <w:r>
-        <w:t>HAN</w:t>
-      </w:r>
-      <w:r>
-        <w:rPr>
-          <w:spacing w:val="-4"/>
-        </w:rPr>
-        <w:t xml:space="preserve"> </w:t>
-      </w:r>
-      <w:r>
-        <w:t>DE</w:t>
-      </w:r>
-      <w:r>
-        <w:rPr>
-          <w:spacing w:val="1"/>
-        </w:rPr>
-        <w:t xml:space="preserve"> </w:t>
-      </w:r>
-      <w:r>
-        <w:t>SER</w:t>
-      </w:r>
-      <w:r>
-        <w:rPr>
-          <w:spacing w:val="6"/>
-        </w:rPr>
-        <w:t xml:space="preserve"> </w:t>
-      </w:r>
-      <w:r>
-        <w:t>CUMPLIMENTADOS</w:t>
-      </w:r>
-      <w:r>
-        <w:rPr>
-          <w:spacing w:val="-6"/>
-        </w:rPr>
-        <w:t xml:space="preserve"> </w:t>
-      </w:r>
-      <w:r>
-        <w:t>OBLIGATORIAMENTE.</w:t>
-      </w:r>
-    </w:p>
-    <w:p>
-      <w:pPr>
-        <w:pStyle w:val="Textoindependiente"/>
-        <w:spacing w:before="11"/>
-        <w:ind w:left="1192" w:right="1096"/>
-        <w:jc w:val="center"/>
-      </w:pPr>
-      <w:r>
-        <w:rPr>
-          <w:spacing w:val="-1"/>
-        </w:rPr>
-        <w:t>UNA</w:t>
-      </w:r>
-      <w:r>
-        <w:rPr>
-          <w:spacing w:val="5"/>
-        </w:rPr>
-        <w:t xml:space="preserve"> </w:t>
-      </w:r>
-      <w:r>
-        <w:rPr>
-          <w:spacing w:val="-1"/>
-        </w:rPr>
-        <w:t>VEZ</w:t>
-      </w:r>
-      <w:r>
-        <w:rPr>
-          <w:spacing w:val="-6"/>
-        </w:rPr>
-        <w:t xml:space="preserve"> </w:t>
-      </w:r>
-      <w:r>
-        <w:rPr>
-          <w:spacing w:val="-1"/>
-        </w:rPr>
-        <w:t>FIRMADA</w:t>
-      </w:r>
-      <w:r>
-        <w:rPr>
-          <w:spacing w:val="6"/>
-        </w:rPr>
-        <w:t xml:space="preserve"> </w:t>
-      </w:r>
-      <w:r>
-        <w:rPr>
-          <w:spacing w:val="-1"/>
-        </w:rPr>
-        <w:t>EST</w:t>
-      </w:r>
-      <w:r>
-        <w:rPr>
-          <w:spacing w:val="-22"/>
-        </w:rPr>
-        <w:t xml:space="preserve"> </w:t>
-      </w:r>
-      <w:r>
-        <w:rPr>
-          <w:spacing w:val="-1"/>
-        </w:rPr>
-        <w:t>A</w:t>
-      </w:r>
-      <w:r>
-        <w:rPr>
-          <w:spacing w:val="-10"/>
-        </w:rPr>
-        <w:t xml:space="preserve"> </w:t>
-      </w:r>
-      <w:r>
-        <w:rPr>
-          <w:spacing w:val="-1"/>
-        </w:rPr>
-        <w:t>ORDEN</w:t>
-      </w:r>
-      <w:r>
-        <w:rPr>
-          <w:spacing w:val="6"/>
-        </w:rPr>
-        <w:t xml:space="preserve"> </w:t>
-      </w:r>
-      <w:r>
-        <w:rPr>
-          <w:spacing w:val="-1"/>
-        </w:rPr>
-        <w:t>DE</w:t>
-      </w:r>
-      <w:r>
-        <w:rPr>
-          <w:spacing w:val="-6"/>
-        </w:rPr>
-        <w:t xml:space="preserve"> </w:t>
-      </w:r>
-      <w:r>
-        <w:rPr>
-          <w:spacing w:val="-1"/>
-        </w:rPr>
-        <w:t>DOMICILIACIÓN</w:t>
-      </w:r>
-      <w:r>
-        <w:rPr>
-          <w:spacing w:val="-10"/>
-        </w:rPr>
-        <w:t xml:space="preserve"> </w:t>
-      </w:r>
-      <w:r>
-        <w:rPr>
-          <w:spacing w:val="-1"/>
-        </w:rPr>
-        <w:t>DEBE</w:t>
-      </w:r>
-      <w:r>
-        <w:rPr>
-          <w:spacing w:val="9"/>
-        </w:rPr>
-        <w:t xml:space="preserve"> </w:t>
-      </w:r>
-      <w:r>
-        <w:rPr>
-          <w:spacing w:val="-1"/>
-        </w:rPr>
-        <w:t>SER ENVIADA</w:t>
-      </w:r>
-      <w:r>
-        <w:rPr>
-          <w:spacing w:val="-9"/>
-        </w:rPr>
-        <w:t xml:space="preserve"> </w:t>
-      </w:r>
-      <w:r>
-        <w:t>AL</w:t>
-      </w:r>
-      <w:r>
-        <w:rPr>
-          <w:spacing w:val="-6"/>
-        </w:rPr>
-        <w:t xml:space="preserve"> </w:t>
-      </w:r>
-      <w:r>
-        <w:t>ACREEDOR</w:t>
-      </w:r>
-      <w:r>
-        <w:rPr>
-          <w:spacing w:val="-16"/>
-        </w:rPr>
-        <w:t xml:space="preserve"> </w:t>
-      </w:r>
-      <w:r>
-        <w:t>PARA</w:t>
-      </w:r>
-      <w:r>
-        <w:rPr>
-          <w:spacing w:val="6"/>
-        </w:rPr>
-        <w:t xml:space="preserve"> </w:t>
-      </w:r>
-      <w:r>
-        <w:t>SU</w:t>
-      </w:r>
-      <w:r>
-        <w:rPr>
-          <w:spacing w:val="5"/>
-        </w:rPr>
-        <w:t xml:space="preserve"> </w:t>
-      </w:r>
-      <w:r>
-        <w:t>CUST</w:t>
-      </w:r>
-      <w:r>
-        <w:rPr>
-          <w:spacing w:val="-22"/>
-        </w:rPr>
-        <w:t xml:space="preserve"> </w:t>
-      </w:r>
-      <w:r>
-        <w:t>ODIA</w:t>
-      </w:r>
-      <w:r>
-        <w:rPr>
-          <w:spacing w:val="-17"/>
-        </w:rPr>
-        <w:t xml:space="preserve"> </w:t>
-      </w:r>
-      <w:r>
-        <w:t>.</w:t>
-      </w:r>
     </w:p>
     <w:p>
       <w:pPr>
@@ -6600,485 +6711,16 @@
           <w:sz w:val="10"/>
           <w:lang w:val="en-US"/>
         </w:rPr>
-        <w:t>ALL</w:t>
-      </w:r>
-      <w:r>
-        <w:rPr>
-          <w:i/>
-          <w:spacing w:val="4"/>
-          <w:w w:val="105"/>
-          <w:sz w:val="10"/>
-          <w:lang w:val="en-US"/>
-        </w:rPr>
-        <w:t xml:space="preserve"> </w:t>
-      </w:r>
-      <w:r>
-        <w:rPr>
-          <w:i/>
-          <w:w w:val="105"/>
-          <w:sz w:val="10"/>
-          <w:lang w:val="en-US"/>
-        </w:rPr>
-        <w:t>GAPS</w:t>
-      </w:r>
-      <w:r>
-        <w:rPr>
-          <w:i/>
-          <w:spacing w:val="11"/>
-          <w:w w:val="105"/>
-          <w:sz w:val="10"/>
-          <w:lang w:val="en-US"/>
-        </w:rPr>
-        <w:t xml:space="preserve"> </w:t>
-      </w:r>
-      <w:r>
-        <w:rPr>
-          <w:i/>
-          <w:w w:val="105"/>
-          <w:sz w:val="10"/>
-          <w:lang w:val="en-US"/>
-        </w:rPr>
-        <w:t>ARE</w:t>
-      </w:r>
-      <w:r>
-        <w:rPr>
-          <w:i/>
-          <w:spacing w:val="-1"/>
-          <w:w w:val="105"/>
-          <w:sz w:val="10"/>
-          <w:lang w:val="en-US"/>
-        </w:rPr>
-        <w:t xml:space="preserve"> </w:t>
-      </w:r>
-      <w:r>
-        <w:rPr>
-          <w:i/>
-          <w:w w:val="105"/>
-          <w:sz w:val="10"/>
-          <w:lang w:val="en-US"/>
-        </w:rPr>
-        <w:t>MAND</w:t>
-      </w:r>
-      <w:r>
-        <w:rPr>
-          <w:i/>
-          <w:spacing w:val="-12"/>
-          <w:w w:val="105"/>
-          <w:sz w:val="10"/>
-          <w:lang w:val="en-US"/>
-        </w:rPr>
-        <w:t xml:space="preserve"> </w:t>
-      </w:r>
-      <w:r>
-        <w:rPr>
-          <w:i/>
-          <w:w w:val="105"/>
-          <w:sz w:val="10"/>
-          <w:lang w:val="en-US"/>
-        </w:rPr>
-        <w:t>ATO</w:t>
-      </w:r>
-      <w:r>
-        <w:rPr>
-          <w:i/>
-          <w:spacing w:val="-12"/>
-          <w:w w:val="105"/>
-          <w:sz w:val="10"/>
-          <w:lang w:val="en-US"/>
-        </w:rPr>
-        <w:t xml:space="preserve"> </w:t>
-      </w:r>
-      <w:r>
-        <w:rPr>
-          <w:i/>
-          <w:w w:val="105"/>
-          <w:sz w:val="10"/>
-          <w:lang w:val="en-US"/>
-        </w:rPr>
-        <w:t>RY.</w:t>
-      </w:r>
-      <w:r>
-        <w:rPr>
-          <w:i/>
-          <w:spacing w:val="7"/>
-          <w:w w:val="105"/>
-          <w:sz w:val="10"/>
-          <w:lang w:val="en-US"/>
-        </w:rPr>
-        <w:t xml:space="preserve"> </w:t>
-      </w:r>
-      <w:r>
-        <w:rPr>
-          <w:i/>
-          <w:w w:val="105"/>
-          <w:sz w:val="10"/>
-          <w:lang w:val="en-US"/>
-        </w:rPr>
-        <w:t>ONCE</w:t>
-      </w:r>
-      <w:r>
-        <w:rPr>
-          <w:i/>
-          <w:spacing w:val="-1"/>
-          <w:w w:val="105"/>
-          <w:sz w:val="10"/>
-          <w:lang w:val="en-US"/>
-        </w:rPr>
-        <w:t xml:space="preserve"> </w:t>
-      </w:r>
-      <w:r>
-        <w:rPr>
-          <w:i/>
-          <w:w w:val="105"/>
-          <w:sz w:val="10"/>
-          <w:lang w:val="en-US"/>
-        </w:rPr>
-        <w:t>TH</w:t>
-      </w:r>
-      <w:r>
-        <w:rPr>
-          <w:i/>
-          <w:spacing w:val="-12"/>
-          <w:w w:val="105"/>
-          <w:sz w:val="10"/>
-          <w:lang w:val="en-US"/>
-        </w:rPr>
-        <w:t xml:space="preserve"> </w:t>
-      </w:r>
-      <w:r>
-        <w:rPr>
-          <w:i/>
-          <w:w w:val="105"/>
-          <w:sz w:val="10"/>
-          <w:lang w:val="en-US"/>
-        </w:rPr>
-        <w:t>IS</w:t>
-      </w:r>
-      <w:r>
-        <w:rPr>
-          <w:i/>
-          <w:spacing w:val="11"/>
-          <w:w w:val="105"/>
-          <w:sz w:val="10"/>
-          <w:lang w:val="en-US"/>
-        </w:rPr>
-        <w:t xml:space="preserve"> </w:t>
-      </w:r>
-      <w:r>
-        <w:rPr>
-          <w:i/>
-          <w:w w:val="105"/>
-          <w:sz w:val="10"/>
-          <w:lang w:val="en-US"/>
-        </w:rPr>
-        <w:t>MANDAT</w:t>
-      </w:r>
-      <w:r>
-        <w:rPr>
-          <w:i/>
-          <w:spacing w:val="-10"/>
-          <w:w w:val="105"/>
-          <w:sz w:val="10"/>
-          <w:lang w:val="en-US"/>
-        </w:rPr>
-        <w:t xml:space="preserve"> </w:t>
-      </w:r>
-      <w:r>
-        <w:rPr>
-          <w:i/>
-          <w:w w:val="105"/>
-          <w:sz w:val="10"/>
-          <w:lang w:val="en-US"/>
-        </w:rPr>
-        <w:t>E</w:t>
-      </w:r>
-      <w:r>
-        <w:rPr>
-          <w:i/>
-          <w:spacing w:val="-1"/>
-          <w:w w:val="105"/>
-          <w:sz w:val="10"/>
-          <w:lang w:val="en-US"/>
-        </w:rPr>
-        <w:t xml:space="preserve"> </w:t>
-      </w:r>
-      <w:r>
-        <w:rPr>
-          <w:i/>
-          <w:w w:val="105"/>
-          <w:sz w:val="10"/>
-          <w:lang w:val="en-US"/>
-        </w:rPr>
-        <w:t>H</w:t>
-      </w:r>
-      <w:r>
-        <w:rPr>
-          <w:i/>
-          <w:spacing w:val="-13"/>
-          <w:w w:val="105"/>
-          <w:sz w:val="10"/>
-          <w:lang w:val="en-US"/>
-        </w:rPr>
-        <w:t xml:space="preserve"> </w:t>
-      </w:r>
-      <w:r>
-        <w:rPr>
-          <w:i/>
-          <w:w w:val="105"/>
-          <w:sz w:val="10"/>
-          <w:lang w:val="en-US"/>
-        </w:rPr>
-        <w:t>AS</w:t>
-      </w:r>
-      <w:r>
-        <w:rPr>
-          <w:i/>
-          <w:spacing w:val="19"/>
-          <w:w w:val="105"/>
-          <w:sz w:val="10"/>
-          <w:lang w:val="en-US"/>
-        </w:rPr>
-        <w:t xml:space="preserve"> </w:t>
-      </w:r>
-      <w:r>
-        <w:rPr>
-          <w:i/>
-          <w:w w:val="105"/>
-          <w:sz w:val="10"/>
-          <w:lang w:val="en-US"/>
-        </w:rPr>
-        <w:t>BEEN</w:t>
-      </w:r>
-      <w:r>
-        <w:rPr>
-          <w:i/>
-          <w:spacing w:val="8"/>
-          <w:w w:val="105"/>
-          <w:sz w:val="10"/>
-          <w:lang w:val="en-US"/>
-        </w:rPr>
-        <w:t xml:space="preserve"> </w:t>
-      </w:r>
-      <w:r>
-        <w:rPr>
-          <w:i/>
-          <w:w w:val="105"/>
-          <w:sz w:val="10"/>
-          <w:lang w:val="en-US"/>
-        </w:rPr>
-        <w:t>SIGNED</w:t>
-      </w:r>
-      <w:r>
-        <w:rPr>
-          <w:i/>
-          <w:spacing w:val="2"/>
-          <w:w w:val="105"/>
-          <w:sz w:val="10"/>
-          <w:lang w:val="en-US"/>
-        </w:rPr>
-        <w:t xml:space="preserve"> </w:t>
-      </w:r>
-      <w:r>
-        <w:rPr>
-          <w:i/>
-          <w:w w:val="105"/>
-          <w:sz w:val="10"/>
-          <w:lang w:val="en-US"/>
-        </w:rPr>
-        <w:t>M</w:t>
-      </w:r>
-      <w:r>
-        <w:rPr>
-          <w:i/>
-          <w:spacing w:val="-9"/>
-          <w:w w:val="105"/>
-          <w:sz w:val="10"/>
-          <w:lang w:val="en-US"/>
-        </w:rPr>
-        <w:t xml:space="preserve"> </w:t>
-      </w:r>
-      <w:r>
-        <w:rPr>
-          <w:i/>
-          <w:w w:val="105"/>
-          <w:sz w:val="10"/>
-          <w:lang w:val="en-US"/>
-        </w:rPr>
-        <w:t>UST</w:t>
-      </w:r>
-      <w:r>
-        <w:rPr>
-          <w:i/>
-          <w:spacing w:val="5"/>
-          <w:w w:val="105"/>
-          <w:sz w:val="10"/>
-          <w:lang w:val="en-US"/>
-        </w:rPr>
-        <w:t xml:space="preserve"> </w:t>
-      </w:r>
-      <w:r>
-        <w:rPr>
-          <w:i/>
-          <w:w w:val="105"/>
-          <w:sz w:val="10"/>
-          <w:lang w:val="en-US"/>
-        </w:rPr>
-        <w:t>BE</w:t>
-      </w:r>
-      <w:r>
-        <w:rPr>
-          <w:i/>
-          <w:spacing w:val="-1"/>
-          <w:w w:val="105"/>
-          <w:sz w:val="10"/>
-          <w:lang w:val="en-US"/>
-        </w:rPr>
-        <w:t xml:space="preserve"> </w:t>
-      </w:r>
-      <w:r>
-        <w:rPr>
-          <w:i/>
-          <w:w w:val="105"/>
-          <w:sz w:val="10"/>
-          <w:lang w:val="en-US"/>
-        </w:rPr>
-        <w:t>SENT</w:t>
-      </w:r>
-      <w:r>
-        <w:rPr>
-          <w:i/>
-          <w:spacing w:val="5"/>
-          <w:w w:val="105"/>
-          <w:sz w:val="10"/>
-          <w:lang w:val="en-US"/>
-        </w:rPr>
-        <w:t xml:space="preserve"> </w:t>
-      </w:r>
-      <w:r>
-        <w:rPr>
-          <w:i/>
-          <w:w w:val="105"/>
-          <w:sz w:val="10"/>
-          <w:lang w:val="en-US"/>
-        </w:rPr>
-        <w:t>TO</w:t>
-      </w:r>
-      <w:r>
-        <w:rPr>
-          <w:i/>
-          <w:spacing w:val="3"/>
-          <w:w w:val="105"/>
-          <w:sz w:val="10"/>
-          <w:lang w:val="en-US"/>
-        </w:rPr>
-        <w:t xml:space="preserve"> </w:t>
-      </w:r>
-      <w:r>
-        <w:rPr>
-          <w:i/>
-          <w:w w:val="105"/>
-          <w:sz w:val="10"/>
-          <w:lang w:val="en-US"/>
-        </w:rPr>
-        <w:t>CRED</w:t>
-      </w:r>
-      <w:r>
-        <w:rPr>
-          <w:i/>
-          <w:spacing w:val="-12"/>
-          <w:w w:val="105"/>
-          <w:sz w:val="10"/>
-          <w:lang w:val="en-US"/>
-        </w:rPr>
-        <w:t xml:space="preserve"> </w:t>
-      </w:r>
-      <w:r>
-        <w:rPr>
-          <w:i/>
-          <w:w w:val="105"/>
-          <w:sz w:val="10"/>
-          <w:lang w:val="en-US"/>
-        </w:rPr>
-        <w:t>ITO</w:t>
-      </w:r>
-      <w:r>
-        <w:rPr>
-          <w:i/>
-          <w:spacing w:val="-12"/>
-          <w:w w:val="105"/>
-          <w:sz w:val="10"/>
-          <w:lang w:val="en-US"/>
-        </w:rPr>
-        <w:t xml:space="preserve"> </w:t>
-      </w:r>
-      <w:r>
-        <w:rPr>
-          <w:i/>
-          <w:w w:val="105"/>
-          <w:sz w:val="10"/>
-          <w:lang w:val="en-US"/>
-        </w:rPr>
-        <w:t>R</w:t>
-      </w:r>
-      <w:r>
-        <w:rPr>
-          <w:i/>
-          <w:spacing w:val="-1"/>
-          <w:w w:val="105"/>
-          <w:sz w:val="10"/>
-          <w:lang w:val="en-US"/>
-        </w:rPr>
-        <w:t xml:space="preserve"> </w:t>
-      </w:r>
-      <w:r>
-        <w:rPr>
-          <w:i/>
-          <w:w w:val="105"/>
-          <w:sz w:val="10"/>
-          <w:lang w:val="en-US"/>
-        </w:rPr>
-        <w:t>FO</w:t>
-      </w:r>
-      <w:r>
-        <w:rPr>
-          <w:i/>
-          <w:spacing w:val="-12"/>
-          <w:w w:val="105"/>
-          <w:sz w:val="10"/>
-          <w:lang w:val="en-US"/>
-        </w:rPr>
-        <w:t xml:space="preserve"> </w:t>
-      </w:r>
-      <w:r>
-        <w:rPr>
-          <w:i/>
-          <w:w w:val="105"/>
-          <w:sz w:val="10"/>
-          <w:lang w:val="en-US"/>
-        </w:rPr>
-        <w:t>R</w:t>
-      </w:r>
-      <w:r>
-        <w:rPr>
-          <w:i/>
-          <w:spacing w:val="-1"/>
-          <w:w w:val="105"/>
-          <w:sz w:val="10"/>
-          <w:lang w:val="en-US"/>
-        </w:rPr>
-        <w:t xml:space="preserve"> </w:t>
-      </w:r>
-      <w:r>
-        <w:rPr>
-          <w:i/>
-          <w:w w:val="105"/>
-          <w:sz w:val="10"/>
-          <w:lang w:val="en-US"/>
-        </w:rPr>
-        <w:t>STORAGE.</w:t>
+        <w:t>.</w:t>
       </w:r>
     </w:p>
     <w:sectPr>
+      <w:headerReference w:type="even" r:id="rId9"/>
+      <w:headerReference w:type="default" r:id="rId10"/>
+      <w:footerReference w:type="even" r:id="rId11"/>
+      <w:footerReference w:type="default" r:id="rId12"/>
+      <w:headerReference w:type="first" r:id="rId13"/>
+      <w:footerReference w:type="first" r:id="rId14"/>
       <w:type w:val="continuous"/>
       <w:pgSz w:w="11910" w:h="16850"/>
       <w:pgMar w:top="1320" w:right="520" w:bottom="280" w:left="720" w:header="720" w:footer="720" w:gutter="0"/>
@@ -7105,6 +6747,771 @@
 </w:endnotes>
 </file>
 
+<file path=word/footer1.xml><?xml version="1.0" encoding="utf-8"?>
+<w:ftr xmlns:wpc="http://schemas.microsoft.com/office/word/2010/wordprocessingCanvas" xmlns:cx="http://schemas.microsoft.com/office/drawing/2014/chartex" xmlns:cx1="http://schemas.microsoft.com/office/drawing/2015/9/8/chartex" xmlns:cx2="http://schemas.microsoft.com/office/drawing/2015/10/21/chartex" xmlns:cx3="http://schemas.microsoft.com/office/drawing/2016/5/9/chartex" xmlns:cx4="http://schemas.microsoft.com/office/drawing/2016/5/10/chartex" xmlns:cx5="http://schemas.microsoft.com/office/drawing/2016/5/11/chartex" xmlns:cx6="http://schemas.microsoft.com/office/drawing/2016/5/12/chartex" xmlns:cx7="http://schemas.microsoft.com/office/drawing/2016/5/13/chartex" xmlns:cx8="http://schemas.microsoft.com/office/drawing/2016/5/14/chartex" xmlns:mc="http://schemas.openxmlformats.org/markup-compatibility/2006" xmlns:aink="http://schemas.microsoft.com/office/drawing/2016/ink" xmlns:am3d="http://schemas.microsoft.com/office/drawing/2017/model3d" xmlns:o="urn:schemas-microsoft-com:office:office" xmlns:oel="http://schemas.microsoft.com/office/2019/extlst" xmlns:r="http://schemas.openxmlformats.org/officeDocument/2006/relationships" xmlns:m="http://schemas.openxmlformats.org/officeDocument/2006/math" xmlns:v="urn:schemas-microsoft-com:vml" xmlns:wp14="http://schemas.microsoft.com/office/word/2010/wordprocessingDrawing" xmlns:wp="http://schemas.openxmlformats.org/drawingml/2006/wordprocessingDrawing" xmlns:w10="urn:schemas-microsoft-com:office:word" xmlns:w="http://schemas.openxmlformats.org/wordprocessingml/2006/main" xmlns:w14="http://schemas.microsoft.com/office/word/2010/wordml" xmlns:w15="http://schemas.microsoft.com/office/word/2012/wordml" xmlns:w16cex="http://schemas.microsoft.com/office/word/2018/wordml/cex" xmlns:w16cid="http://schemas.microsoft.com/office/word/2016/wordml/cid" xmlns:w16="http://schemas.microsoft.com/office/word/2018/wordml" xmlns:w16du="http://schemas.microsoft.com/office/word/2023/wordml/word16du" xmlns:w16sdtdh="http://schemas.microsoft.com/office/word/2020/wordml/sdtdatahash" xmlns:w16sdtfl="http://schemas.microsoft.com/office/word/2024/wordml/sdtformatlock" xmlns:w16se="http://schemas.microsoft.com/office/word/2015/wordml/symex" xmlns:wpg="http://schemas.microsoft.com/office/word/2010/wordprocessingGroup" xmlns:wpi="http://schemas.microsoft.com/office/word/2010/wordprocessingInk" xmlns:wne="http://schemas.microsoft.com/office/word/2006/wordml" xmlns:wps="http://schemas.microsoft.com/office/word/2010/wordprocessingShape" mc:Ignorable="w14 w15 w16se w16cid w16 w16cex w16sdtdh w16sdtfl w16du wp14">
+  <w:p>
+    <w:pPr>
+      <w:pStyle w:val="Piedepgina"/>
+    </w:pPr>
+  </w:p>
+</w:ftr>
+</file>
+
+<file path=word/footer2.xml><?xml version="1.0" encoding="utf-8"?>
+<w:ftr xmlns:wpc="http://schemas.microsoft.com/office/word/2010/wordprocessingCanvas" xmlns:cx="http://schemas.microsoft.com/office/drawing/2014/chartex" xmlns:cx1="http://schemas.microsoft.com/office/drawing/2015/9/8/chartex" xmlns:cx2="http://schemas.microsoft.com/office/drawing/2015/10/21/chartex" xmlns:cx3="http://schemas.microsoft.com/office/drawing/2016/5/9/chartex" xmlns:cx4="http://schemas.microsoft.com/office/drawing/2016/5/10/chartex" xmlns:cx5="http://schemas.microsoft.com/office/drawing/2016/5/11/chartex" xmlns:cx6="http://schemas.microsoft.com/office/drawing/2016/5/12/chartex" xmlns:cx7="http://schemas.microsoft.com/office/drawing/2016/5/13/chartex" xmlns:cx8="http://schemas.microsoft.com/office/drawing/2016/5/14/chartex" xmlns:mc="http://schemas.openxmlformats.org/markup-compatibility/2006" xmlns:aink="http://schemas.microsoft.com/office/drawing/2016/ink" xmlns:am3d="http://schemas.microsoft.com/office/drawing/2017/model3d" xmlns:o="urn:schemas-microsoft-com:office:office" xmlns:oel="http://schemas.microsoft.com/office/2019/extlst" xmlns:r="http://schemas.openxmlformats.org/officeDocument/2006/relationships" xmlns:m="http://schemas.openxmlformats.org/officeDocument/2006/math" xmlns:v="urn:schemas-microsoft-com:vml" xmlns:wp14="http://schemas.microsoft.com/office/word/2010/wordprocessingDrawing" xmlns:wp="http://schemas.openxmlformats.org/drawingml/2006/wordprocessingDrawing" xmlns:w10="urn:schemas-microsoft-com:office:word" xmlns:w="http://schemas.openxmlformats.org/wordprocessingml/2006/main" xmlns:w14="http://schemas.microsoft.com/office/word/2010/wordml" xmlns:w15="http://schemas.microsoft.com/office/word/2012/wordml" xmlns:w16cex="http://schemas.microsoft.com/office/word/2018/wordml/cex" xmlns:w16cid="http://schemas.microsoft.com/office/word/2016/wordml/cid" xmlns:w16="http://schemas.microsoft.com/office/word/2018/wordml" xmlns:w16du="http://schemas.microsoft.com/office/word/2023/wordml/word16du" xmlns:w16sdtdh="http://schemas.microsoft.com/office/word/2020/wordml/sdtdatahash" xmlns:w16sdtfl="http://schemas.microsoft.com/office/word/2024/wordml/sdtformatlock" xmlns:w16se="http://schemas.microsoft.com/office/word/2015/wordml/symex" xmlns:wpg="http://schemas.microsoft.com/office/word/2010/wordprocessingGroup" xmlns:wpi="http://schemas.microsoft.com/office/word/2010/wordprocessingInk" xmlns:wne="http://schemas.microsoft.com/office/word/2006/wordml" xmlns:wps="http://schemas.microsoft.com/office/word/2010/wordprocessingShape" mc:Ignorable="w14 w15 w16se w16cid w16 w16cex w16sdtdh w16sdtfl w16du wp14">
+  <w:p>
+    <w:pPr>
+      <w:pStyle w:val="Textoindependiente"/>
+      <w:spacing w:before="97"/>
+      <w:ind w:left="1177" w:right="1096"/>
+      <w:jc w:val="center"/>
+    </w:pPr>
+    <w:r>
+      <w:t>TODOS</w:t>
+    </w:r>
+    <w:r>
+      <w:rPr>
+        <w:spacing w:val="-7"/>
+      </w:rPr>
+      <w:t xml:space="preserve"> </w:t>
+    </w:r>
+    <w:r>
+      <w:t>LOS</w:t>
+    </w:r>
+    <w:r>
+      <w:rPr>
+        <w:spacing w:val="-6"/>
+      </w:rPr>
+      <w:t xml:space="preserve"> </w:t>
+    </w:r>
+    <w:r>
+      <w:t>CAMPOS</w:t>
+    </w:r>
+    <w:r>
+      <w:rPr>
+        <w:spacing w:val="-7"/>
+      </w:rPr>
+      <w:t xml:space="preserve"> </w:t>
+    </w:r>
+    <w:r>
+      <w:t>HAN</w:t>
+    </w:r>
+    <w:r>
+      <w:rPr>
+        <w:spacing w:val="-4"/>
+      </w:rPr>
+      <w:t xml:space="preserve"> </w:t>
+    </w:r>
+    <w:r>
+      <w:t>DE</w:t>
+    </w:r>
+    <w:r>
+      <w:rPr>
+        <w:spacing w:val="1"/>
+      </w:rPr>
+      <w:t xml:space="preserve"> </w:t>
+    </w:r>
+    <w:r>
+      <w:t>SER</w:t>
+    </w:r>
+    <w:r>
+      <w:rPr>
+        <w:spacing w:val="6"/>
+      </w:rPr>
+      <w:t xml:space="preserve"> </w:t>
+    </w:r>
+    <w:r>
+      <w:t>CUMPLIMENTADOS</w:t>
+    </w:r>
+    <w:r>
+      <w:rPr>
+        <w:spacing w:val="-6"/>
+      </w:rPr>
+      <w:t xml:space="preserve"> </w:t>
+    </w:r>
+    <w:r>
+      <w:t>OBLIGATORIAMENTE.</w:t>
+    </w:r>
+  </w:p>
+  <w:p>
+    <w:pPr>
+      <w:pStyle w:val="Textoindependiente"/>
+      <w:spacing w:before="11"/>
+      <w:ind w:left="1192" w:right="1096"/>
+      <w:jc w:val="center"/>
+    </w:pPr>
+    <w:r>
+      <w:rPr>
+        <w:spacing w:val="-1"/>
+      </w:rPr>
+      <w:t>UNA</w:t>
+    </w:r>
+    <w:r>
+      <w:rPr>
+        <w:spacing w:val="5"/>
+      </w:rPr>
+      <w:t xml:space="preserve"> </w:t>
+    </w:r>
+    <w:r>
+      <w:rPr>
+        <w:spacing w:val="-1"/>
+      </w:rPr>
+      <w:t>VEZ</w:t>
+    </w:r>
+    <w:r>
+      <w:rPr>
+        <w:spacing w:val="-6"/>
+      </w:rPr>
+      <w:t xml:space="preserve"> </w:t>
+    </w:r>
+    <w:r>
+      <w:rPr>
+        <w:spacing w:val="-1"/>
+      </w:rPr>
+      <w:t>FIRMADA</w:t>
+    </w:r>
+    <w:r>
+      <w:rPr>
+        <w:spacing w:val="6"/>
+      </w:rPr>
+      <w:t xml:space="preserve"> </w:t>
+    </w:r>
+    <w:r>
+      <w:rPr>
+        <w:spacing w:val="-1"/>
+      </w:rPr>
+      <w:t>EST</w:t>
+    </w:r>
+    <w:r>
+      <w:rPr>
+        <w:spacing w:val="-22"/>
+      </w:rPr>
+      <w:t xml:space="preserve"> </w:t>
+    </w:r>
+    <w:r>
+      <w:rPr>
+        <w:spacing w:val="-1"/>
+      </w:rPr>
+      <w:t>A</w:t>
+    </w:r>
+    <w:r>
+      <w:rPr>
+        <w:spacing w:val="-10"/>
+      </w:rPr>
+      <w:t xml:space="preserve"> </w:t>
+    </w:r>
+    <w:r>
+      <w:rPr>
+        <w:spacing w:val="-1"/>
+      </w:rPr>
+      <w:t>ORDEN</w:t>
+    </w:r>
+    <w:r>
+      <w:rPr>
+        <w:spacing w:val="6"/>
+      </w:rPr>
+      <w:t xml:space="preserve"> </w:t>
+    </w:r>
+    <w:r>
+      <w:rPr>
+        <w:spacing w:val="-1"/>
+      </w:rPr>
+      <w:t>DE</w:t>
+    </w:r>
+    <w:r>
+      <w:rPr>
+        <w:spacing w:val="-6"/>
+      </w:rPr>
+      <w:t xml:space="preserve"> </w:t>
+    </w:r>
+    <w:r>
+      <w:rPr>
+        <w:spacing w:val="-1"/>
+      </w:rPr>
+      <w:t>DOMICILIACIÓN</w:t>
+    </w:r>
+    <w:r>
+      <w:rPr>
+        <w:spacing w:val="-10"/>
+      </w:rPr>
+      <w:t xml:space="preserve"> </w:t>
+    </w:r>
+    <w:r>
+      <w:rPr>
+        <w:spacing w:val="-1"/>
+      </w:rPr>
+      <w:t>DEBE</w:t>
+    </w:r>
+    <w:r>
+      <w:rPr>
+        <w:spacing w:val="9"/>
+      </w:rPr>
+      <w:t xml:space="preserve"> </w:t>
+    </w:r>
+    <w:r>
+      <w:rPr>
+        <w:spacing w:val="-1"/>
+      </w:rPr>
+      <w:t>SER ENVIADA</w:t>
+    </w:r>
+    <w:r>
+      <w:rPr>
+        <w:spacing w:val="-9"/>
+      </w:rPr>
+      <w:t xml:space="preserve"> </w:t>
+    </w:r>
+    <w:r>
+      <w:t>AL</w:t>
+    </w:r>
+    <w:r>
+      <w:rPr>
+        <w:spacing w:val="-6"/>
+      </w:rPr>
+      <w:t xml:space="preserve"> </w:t>
+    </w:r>
+    <w:r>
+      <w:t>ACREEDOR</w:t>
+    </w:r>
+    <w:r>
+      <w:rPr>
+        <w:spacing w:val="-16"/>
+      </w:rPr>
+      <w:t xml:space="preserve"> </w:t>
+    </w:r>
+    <w:r>
+      <w:t>PARA</w:t>
+    </w:r>
+    <w:r>
+      <w:rPr>
+        <w:spacing w:val="6"/>
+      </w:rPr>
+      <w:t xml:space="preserve"> </w:t>
+    </w:r>
+    <w:r>
+      <w:t>SU</w:t>
+    </w:r>
+    <w:r>
+      <w:rPr>
+        <w:spacing w:val="5"/>
+      </w:rPr>
+      <w:t xml:space="preserve"> </w:t>
+    </w:r>
+    <w:r>
+      <w:t>CUSTODIA</w:t>
+    </w:r>
+    <w:r>
+      <w:rPr>
+        <w:spacing w:val="-17"/>
+      </w:rPr>
+      <w:t>.</w:t>
+    </w:r>
+  </w:p>
+  <w:p>
+    <w:pPr>
+      <w:pStyle w:val="Piedepgina"/>
+      <w:jc w:val="center"/>
+      <w:rPr>
+        <w:lang w:val="en-US"/>
+      </w:rPr>
+    </w:pPr>
+    <w:r>
+      <w:rPr>
+        <w:i/>
+        <w:w w:val="105"/>
+        <w:sz w:val="10"/>
+        <w:lang w:val="en-US"/>
+      </w:rPr>
+      <w:t>ALL</w:t>
+    </w:r>
+    <w:r>
+      <w:rPr>
+        <w:i/>
+        <w:spacing w:val="4"/>
+        <w:w w:val="105"/>
+        <w:sz w:val="10"/>
+        <w:lang w:val="en-US"/>
+      </w:rPr>
+      <w:t xml:space="preserve"> </w:t>
+    </w:r>
+    <w:r>
+      <w:rPr>
+        <w:i/>
+        <w:w w:val="105"/>
+        <w:sz w:val="10"/>
+        <w:lang w:val="en-US"/>
+      </w:rPr>
+      <w:t>GAPS</w:t>
+    </w:r>
+    <w:r>
+      <w:rPr>
+        <w:i/>
+        <w:spacing w:val="11"/>
+        <w:w w:val="105"/>
+        <w:sz w:val="10"/>
+        <w:lang w:val="en-US"/>
+      </w:rPr>
+      <w:t xml:space="preserve"> </w:t>
+    </w:r>
+    <w:r>
+      <w:rPr>
+        <w:i/>
+        <w:w w:val="105"/>
+        <w:sz w:val="10"/>
+        <w:lang w:val="en-US"/>
+      </w:rPr>
+      <w:t>ARE</w:t>
+    </w:r>
+    <w:r>
+      <w:rPr>
+        <w:i/>
+        <w:spacing w:val="-1"/>
+        <w:w w:val="105"/>
+        <w:sz w:val="10"/>
+        <w:lang w:val="en-US"/>
+      </w:rPr>
+      <w:t xml:space="preserve"> </w:t>
+    </w:r>
+    <w:r>
+      <w:rPr>
+        <w:i/>
+        <w:w w:val="105"/>
+        <w:sz w:val="10"/>
+        <w:lang w:val="en-US"/>
+      </w:rPr>
+      <w:t>MAND</w:t>
+    </w:r>
+    <w:r>
+      <w:rPr>
+        <w:i/>
+        <w:spacing w:val="-12"/>
+        <w:w w:val="105"/>
+        <w:sz w:val="10"/>
+        <w:lang w:val="en-US"/>
+      </w:rPr>
+      <w:t xml:space="preserve"> </w:t>
+    </w:r>
+    <w:r>
+      <w:rPr>
+        <w:i/>
+        <w:w w:val="105"/>
+        <w:sz w:val="10"/>
+        <w:lang w:val="en-US"/>
+      </w:rPr>
+      <w:t>ATO</w:t>
+    </w:r>
+    <w:r>
+      <w:rPr>
+        <w:i/>
+        <w:spacing w:val="-12"/>
+        <w:w w:val="105"/>
+        <w:sz w:val="10"/>
+        <w:lang w:val="en-US"/>
+      </w:rPr>
+      <w:t xml:space="preserve"> </w:t>
+    </w:r>
+    <w:r>
+      <w:rPr>
+        <w:i/>
+        <w:w w:val="105"/>
+        <w:sz w:val="10"/>
+        <w:lang w:val="en-US"/>
+      </w:rPr>
+      <w:t>RY.</w:t>
+    </w:r>
+    <w:r>
+      <w:rPr>
+        <w:i/>
+        <w:spacing w:val="7"/>
+        <w:w w:val="105"/>
+        <w:sz w:val="10"/>
+        <w:lang w:val="en-US"/>
+      </w:rPr>
+      <w:t xml:space="preserve"> </w:t>
+    </w:r>
+    <w:r>
+      <w:rPr>
+        <w:i/>
+        <w:w w:val="105"/>
+        <w:sz w:val="10"/>
+        <w:lang w:val="en-US"/>
+      </w:rPr>
+      <w:t>ONCE</w:t>
+    </w:r>
+    <w:r>
+      <w:rPr>
+        <w:i/>
+        <w:spacing w:val="-1"/>
+        <w:w w:val="105"/>
+        <w:sz w:val="10"/>
+        <w:lang w:val="en-US"/>
+      </w:rPr>
+      <w:t xml:space="preserve"> </w:t>
+    </w:r>
+    <w:r>
+      <w:rPr>
+        <w:i/>
+        <w:w w:val="105"/>
+        <w:sz w:val="10"/>
+        <w:lang w:val="en-US"/>
+      </w:rPr>
+      <w:t>TH</w:t>
+    </w:r>
+    <w:r>
+      <w:rPr>
+        <w:i/>
+        <w:spacing w:val="-12"/>
+        <w:w w:val="105"/>
+        <w:sz w:val="10"/>
+        <w:lang w:val="en-US"/>
+      </w:rPr>
+      <w:t xml:space="preserve"> </w:t>
+    </w:r>
+    <w:r>
+      <w:rPr>
+        <w:i/>
+        <w:w w:val="105"/>
+        <w:sz w:val="10"/>
+        <w:lang w:val="en-US"/>
+      </w:rPr>
+      <w:t>IS</w:t>
+    </w:r>
+    <w:r>
+      <w:rPr>
+        <w:i/>
+        <w:spacing w:val="11"/>
+        <w:w w:val="105"/>
+        <w:sz w:val="10"/>
+        <w:lang w:val="en-US"/>
+      </w:rPr>
+      <w:t xml:space="preserve"> </w:t>
+    </w:r>
+    <w:r>
+      <w:rPr>
+        <w:i/>
+        <w:w w:val="105"/>
+        <w:sz w:val="10"/>
+        <w:lang w:val="en-US"/>
+      </w:rPr>
+      <w:t>MANDAT</w:t>
+    </w:r>
+    <w:r>
+      <w:rPr>
+        <w:i/>
+        <w:spacing w:val="-10"/>
+        <w:w w:val="105"/>
+        <w:sz w:val="10"/>
+        <w:lang w:val="en-US"/>
+      </w:rPr>
+      <w:t xml:space="preserve"> </w:t>
+    </w:r>
+    <w:r>
+      <w:rPr>
+        <w:i/>
+        <w:w w:val="105"/>
+        <w:sz w:val="10"/>
+        <w:lang w:val="en-US"/>
+      </w:rPr>
+      <w:t>E</w:t>
+    </w:r>
+    <w:r>
+      <w:rPr>
+        <w:i/>
+        <w:spacing w:val="-1"/>
+        <w:w w:val="105"/>
+        <w:sz w:val="10"/>
+        <w:lang w:val="en-US"/>
+      </w:rPr>
+      <w:t xml:space="preserve"> </w:t>
+    </w:r>
+    <w:r>
+      <w:rPr>
+        <w:i/>
+        <w:w w:val="105"/>
+        <w:sz w:val="10"/>
+        <w:lang w:val="en-US"/>
+      </w:rPr>
+      <w:t>H</w:t>
+    </w:r>
+    <w:r>
+      <w:rPr>
+        <w:i/>
+        <w:spacing w:val="-13"/>
+        <w:w w:val="105"/>
+        <w:sz w:val="10"/>
+        <w:lang w:val="en-US"/>
+      </w:rPr>
+      <w:t xml:space="preserve"> </w:t>
+    </w:r>
+    <w:r>
+      <w:rPr>
+        <w:i/>
+        <w:w w:val="105"/>
+        <w:sz w:val="10"/>
+        <w:lang w:val="en-US"/>
+      </w:rPr>
+      <w:t>AS</w:t>
+    </w:r>
+    <w:r>
+      <w:rPr>
+        <w:i/>
+        <w:spacing w:val="19"/>
+        <w:w w:val="105"/>
+        <w:sz w:val="10"/>
+        <w:lang w:val="en-US"/>
+      </w:rPr>
+      <w:t xml:space="preserve"> </w:t>
+    </w:r>
+    <w:r>
+      <w:rPr>
+        <w:i/>
+        <w:w w:val="105"/>
+        <w:sz w:val="10"/>
+        <w:lang w:val="en-US"/>
+      </w:rPr>
+      <w:t>BEEN</w:t>
+    </w:r>
+    <w:r>
+      <w:rPr>
+        <w:i/>
+        <w:spacing w:val="8"/>
+        <w:w w:val="105"/>
+        <w:sz w:val="10"/>
+        <w:lang w:val="en-US"/>
+      </w:rPr>
+      <w:t xml:space="preserve"> </w:t>
+    </w:r>
+    <w:r>
+      <w:rPr>
+        <w:i/>
+        <w:w w:val="105"/>
+        <w:sz w:val="10"/>
+        <w:lang w:val="en-US"/>
+      </w:rPr>
+      <w:t>SIGNED</w:t>
+    </w:r>
+    <w:r>
+      <w:rPr>
+        <w:i/>
+        <w:spacing w:val="2"/>
+        <w:w w:val="105"/>
+        <w:sz w:val="10"/>
+        <w:lang w:val="en-US"/>
+      </w:rPr>
+      <w:t xml:space="preserve"> </w:t>
+    </w:r>
+    <w:r>
+      <w:rPr>
+        <w:i/>
+        <w:w w:val="105"/>
+        <w:sz w:val="10"/>
+        <w:lang w:val="en-US"/>
+      </w:rPr>
+      <w:t>M</w:t>
+    </w:r>
+    <w:r>
+      <w:rPr>
+        <w:i/>
+        <w:spacing w:val="-9"/>
+        <w:w w:val="105"/>
+        <w:sz w:val="10"/>
+        <w:lang w:val="en-US"/>
+      </w:rPr>
+      <w:t xml:space="preserve"> </w:t>
+    </w:r>
+    <w:r>
+      <w:rPr>
+        <w:i/>
+        <w:w w:val="105"/>
+        <w:sz w:val="10"/>
+        <w:lang w:val="en-US"/>
+      </w:rPr>
+      <w:t>UST</w:t>
+    </w:r>
+    <w:r>
+      <w:rPr>
+        <w:i/>
+        <w:spacing w:val="5"/>
+        <w:w w:val="105"/>
+        <w:sz w:val="10"/>
+        <w:lang w:val="en-US"/>
+      </w:rPr>
+      <w:t xml:space="preserve"> </w:t>
+    </w:r>
+    <w:r>
+      <w:rPr>
+        <w:i/>
+        <w:w w:val="105"/>
+        <w:sz w:val="10"/>
+        <w:lang w:val="en-US"/>
+      </w:rPr>
+      <w:t>BE</w:t>
+    </w:r>
+    <w:r>
+      <w:rPr>
+        <w:i/>
+        <w:spacing w:val="-1"/>
+        <w:w w:val="105"/>
+        <w:sz w:val="10"/>
+        <w:lang w:val="en-US"/>
+      </w:rPr>
+      <w:t xml:space="preserve"> </w:t>
+    </w:r>
+    <w:r>
+      <w:rPr>
+        <w:i/>
+        <w:w w:val="105"/>
+        <w:sz w:val="10"/>
+        <w:lang w:val="en-US"/>
+      </w:rPr>
+      <w:t>SENT</w:t>
+    </w:r>
+    <w:r>
+      <w:rPr>
+        <w:i/>
+        <w:spacing w:val="5"/>
+        <w:w w:val="105"/>
+        <w:sz w:val="10"/>
+        <w:lang w:val="en-US"/>
+      </w:rPr>
+      <w:t xml:space="preserve"> </w:t>
+    </w:r>
+    <w:r>
+      <w:rPr>
+        <w:i/>
+        <w:w w:val="105"/>
+        <w:sz w:val="10"/>
+        <w:lang w:val="en-US"/>
+      </w:rPr>
+      <w:t>TO</w:t>
+    </w:r>
+    <w:r>
+      <w:rPr>
+        <w:i/>
+        <w:spacing w:val="3"/>
+        <w:w w:val="105"/>
+        <w:sz w:val="10"/>
+        <w:lang w:val="en-US"/>
+      </w:rPr>
+      <w:t xml:space="preserve"> </w:t>
+    </w:r>
+    <w:r>
+      <w:rPr>
+        <w:i/>
+        <w:w w:val="105"/>
+        <w:sz w:val="10"/>
+        <w:lang w:val="en-US"/>
+      </w:rPr>
+      <w:t>CRED</w:t>
+    </w:r>
+    <w:r>
+      <w:rPr>
+        <w:i/>
+        <w:spacing w:val="-12"/>
+        <w:w w:val="105"/>
+        <w:sz w:val="10"/>
+        <w:lang w:val="en-US"/>
+      </w:rPr>
+      <w:t xml:space="preserve"> </w:t>
+    </w:r>
+    <w:r>
+      <w:rPr>
+        <w:i/>
+        <w:w w:val="105"/>
+        <w:sz w:val="10"/>
+        <w:lang w:val="en-US"/>
+      </w:rPr>
+      <w:t>ITO</w:t>
+    </w:r>
+    <w:r>
+      <w:rPr>
+        <w:i/>
+        <w:spacing w:val="-12"/>
+        <w:w w:val="105"/>
+        <w:sz w:val="10"/>
+        <w:lang w:val="en-US"/>
+      </w:rPr>
+      <w:t xml:space="preserve"> </w:t>
+    </w:r>
+    <w:r>
+      <w:rPr>
+        <w:i/>
+        <w:w w:val="105"/>
+        <w:sz w:val="10"/>
+        <w:lang w:val="en-US"/>
+      </w:rPr>
+      <w:t>R</w:t>
+    </w:r>
+    <w:r>
+      <w:rPr>
+        <w:i/>
+        <w:spacing w:val="-1"/>
+        <w:w w:val="105"/>
+        <w:sz w:val="10"/>
+        <w:lang w:val="en-US"/>
+      </w:rPr>
+      <w:t xml:space="preserve"> </w:t>
+    </w:r>
+    <w:r>
+      <w:rPr>
+        <w:i/>
+        <w:w w:val="105"/>
+        <w:sz w:val="10"/>
+        <w:lang w:val="en-US"/>
+      </w:rPr>
+      <w:t>FO</w:t>
+    </w:r>
+    <w:r>
+      <w:rPr>
+        <w:i/>
+        <w:spacing w:val="-12"/>
+        <w:w w:val="105"/>
+        <w:sz w:val="10"/>
+        <w:lang w:val="en-US"/>
+      </w:rPr>
+      <w:t xml:space="preserve"> </w:t>
+    </w:r>
+    <w:r>
+      <w:rPr>
+        <w:i/>
+        <w:w w:val="105"/>
+        <w:sz w:val="10"/>
+        <w:lang w:val="en-US"/>
+      </w:rPr>
+      <w:t>R</w:t>
+    </w:r>
+    <w:r>
+      <w:rPr>
+        <w:i/>
+        <w:spacing w:val="-1"/>
+        <w:w w:val="105"/>
+        <w:sz w:val="10"/>
+        <w:lang w:val="en-US"/>
+      </w:rPr>
+      <w:t xml:space="preserve"> </w:t>
+    </w:r>
+    <w:r>
+      <w:rPr>
+        <w:i/>
+        <w:w w:val="105"/>
+        <w:sz w:val="10"/>
+        <w:lang w:val="en-US"/>
+      </w:rPr>
+      <w:t>STORAGE</w:t>
+    </w:r>
+  </w:p>
+</w:ftr>
+</file>
+
+<file path=word/footer3.xml><?xml version="1.0" encoding="utf-8"?>
+<w:ftr xmlns:wpc="http://schemas.microsoft.com/office/word/2010/wordprocessingCanvas" xmlns:cx="http://schemas.microsoft.com/office/drawing/2014/chartex" xmlns:cx1="http://schemas.microsoft.com/office/drawing/2015/9/8/chartex" xmlns:cx2="http://schemas.microsoft.com/office/drawing/2015/10/21/chartex" xmlns:cx3="http://schemas.microsoft.com/office/drawing/2016/5/9/chartex" xmlns:cx4="http://schemas.microsoft.com/office/drawing/2016/5/10/chartex" xmlns:cx5="http://schemas.microsoft.com/office/drawing/2016/5/11/chartex" xmlns:cx6="http://schemas.microsoft.com/office/drawing/2016/5/12/chartex" xmlns:cx7="http://schemas.microsoft.com/office/drawing/2016/5/13/chartex" xmlns:cx8="http://schemas.microsoft.com/office/drawing/2016/5/14/chartex" xmlns:mc="http://schemas.openxmlformats.org/markup-compatibility/2006" xmlns:aink="http://schemas.microsoft.com/office/drawing/2016/ink" xmlns:am3d="http://schemas.microsoft.com/office/drawing/2017/model3d" xmlns:o="urn:schemas-microsoft-com:office:office" xmlns:oel="http://schemas.microsoft.com/office/2019/extlst" xmlns:r="http://schemas.openxmlformats.org/officeDocument/2006/relationships" xmlns:m="http://schemas.openxmlformats.org/officeDocument/2006/math" xmlns:v="urn:schemas-microsoft-com:vml" xmlns:wp14="http://schemas.microsoft.com/office/word/2010/wordprocessingDrawing" xmlns:wp="http://schemas.openxmlformats.org/drawingml/2006/wordprocessingDrawing" xmlns:w10="urn:schemas-microsoft-com:office:word" xmlns:w="http://schemas.openxmlformats.org/wordprocessingml/2006/main" xmlns:w14="http://schemas.microsoft.com/office/word/2010/wordml" xmlns:w15="http://schemas.microsoft.com/office/word/2012/wordml" xmlns:w16cex="http://schemas.microsoft.com/office/word/2018/wordml/cex" xmlns:w16cid="http://schemas.microsoft.com/office/word/2016/wordml/cid" xmlns:w16="http://schemas.microsoft.com/office/word/2018/wordml" xmlns:w16du="http://schemas.microsoft.com/office/word/2023/wordml/word16du" xmlns:w16sdtdh="http://schemas.microsoft.com/office/word/2020/wordml/sdtdatahash" xmlns:w16sdtfl="http://schemas.microsoft.com/office/word/2024/wordml/sdtformatlock" xmlns:w16se="http://schemas.microsoft.com/office/word/2015/wordml/symex" xmlns:wpg="http://schemas.microsoft.com/office/word/2010/wordprocessingGroup" xmlns:wpi="http://schemas.microsoft.com/office/word/2010/wordprocessingInk" xmlns:wne="http://schemas.microsoft.com/office/word/2006/wordml" xmlns:wps="http://schemas.microsoft.com/office/word/2010/wordprocessingShape" mc:Ignorable="w14 w15 w16se w16cid w16 w16cex w16sdtdh w16sdtfl w16du wp14">
+  <w:p>
+    <w:pPr>
+      <w:pStyle w:val="Piedepgina"/>
+    </w:pPr>
+  </w:p>
+</w:ftr>
+</file>
+
 <file path=word/footnotes.xml><?xml version="1.0" encoding="utf-8"?>
 <w:footnotes xmlns:wpc="http://schemas.microsoft.com/office/word/2010/wordprocessingCanvas" xmlns:cx="http://schemas.microsoft.com/office/drawing/2014/chartex" xmlns:cx1="http://schemas.microsoft.com/office/drawing/2015/9/8/chartex" xmlns:cx2="http://schemas.microsoft.com/office/drawing/2015/10/21/chartex" xmlns:cx3="http://schemas.microsoft.com/office/drawing/2016/5/9/chartex" xmlns:cx4="http://schemas.microsoft.com/office/drawing/2016/5/10/chartex" xmlns:cx5="http://schemas.microsoft.com/office/drawing/2016/5/11/chartex" xmlns:cx6="http://schemas.microsoft.com/office/drawing/2016/5/12/chartex" xmlns:cx7="http://schemas.microsoft.com/office/drawing/2016/5/13/chartex" xmlns:cx8="http://schemas.microsoft.com/office/drawing/2016/5/14/chartex" xmlns:mc="http://schemas.openxmlformats.org/markup-compatibility/2006" xmlns:aink="http://schemas.microsoft.com/office/drawing/2016/ink" xmlns:am3d="http://schemas.microsoft.com/office/drawing/2017/model3d" xmlns:o="urn:schemas-microsoft-com:office:office" xmlns:oel="http://schemas.microsoft.com/office/2019/extlst" xmlns:r="http://schemas.openxmlformats.org/officeDocument/2006/relationships" xmlns:m="http://schemas.openxmlformats.org/officeDocument/2006/math" xmlns:v="urn:schemas-microsoft-com:vml" xmlns:wp14="http://schemas.microsoft.com/office/word/2010/wordprocessingDrawing" xmlns:wp="http://schemas.openxmlformats.org/drawingml/2006/wordprocessingDrawing" xmlns:w10="urn:schemas-microsoft-com:office:word" xmlns:w="http://schemas.openxmlformats.org/wordprocessingml/2006/main" xmlns:w14="http://schemas.microsoft.com/office/word/2010/wordml" xmlns:w15="http://schemas.microsoft.com/office/word/2012/wordml" xmlns:w16cex="http://schemas.microsoft.com/office/word/2018/wordml/cex" xmlns:w16cid="http://schemas.microsoft.com/office/word/2016/wordml/cid" xmlns:w16="http://schemas.microsoft.com/office/word/2018/wordml" xmlns:w16du="http://schemas.microsoft.com/office/word/2023/wordml/word16du" xmlns:w16sdtdh="http://schemas.microsoft.com/office/word/2020/wordml/sdtdatahash" xmlns:w16sdtfl="http://schemas.microsoft.com/office/word/2024/wordml/sdtformatlock" xmlns:w16se="http://schemas.microsoft.com/office/word/2015/wordml/symex" xmlns:wpg="http://schemas.microsoft.com/office/word/2010/wordprocessingGroup" xmlns:wpi="http://schemas.microsoft.com/office/word/2010/wordprocessingInk" xmlns:wne="http://schemas.microsoft.com/office/word/2006/wordml" xmlns:wps="http://schemas.microsoft.com/office/word/2010/wordprocessingShape" mc:Ignorable="w14 w15 w16se w16cid w16 w16cex w16sdtdh w16sdtfl w16du wp14">
   <w:footnote w:type="separator" w:id="-1">
@@ -7114,6 +7521,36 @@
     <w:p/>
   </w:footnote>
 </w:footnotes>
+</file>
+
+<file path=word/header1.xml><?xml version="1.0" encoding="utf-8"?>
+<w:hdr xmlns:wpc="http://schemas.microsoft.com/office/word/2010/wordprocessingCanvas" xmlns:cx="http://schemas.microsoft.com/office/drawing/2014/chartex" xmlns:cx1="http://schemas.microsoft.com/office/drawing/2015/9/8/chartex" xmlns:cx2="http://schemas.microsoft.com/office/drawing/2015/10/21/chartex" xmlns:cx3="http://schemas.microsoft.com/office/drawing/2016/5/9/chartex" xmlns:cx4="http://schemas.microsoft.com/office/drawing/2016/5/10/chartex" xmlns:cx5="http://schemas.microsoft.com/office/drawing/2016/5/11/chartex" xmlns:cx6="http://schemas.microsoft.com/office/drawing/2016/5/12/chartex" xmlns:cx7="http://schemas.microsoft.com/office/drawing/2016/5/13/chartex" xmlns:cx8="http://schemas.microsoft.com/office/drawing/2016/5/14/chartex" xmlns:mc="http://schemas.openxmlformats.org/markup-compatibility/2006" xmlns:aink="http://schemas.microsoft.com/office/drawing/2016/ink" xmlns:am3d="http://schemas.microsoft.com/office/drawing/2017/model3d" xmlns:o="urn:schemas-microsoft-com:office:office" xmlns:oel="http://schemas.microsoft.com/office/2019/extlst" xmlns:r="http://schemas.openxmlformats.org/officeDocument/2006/relationships" xmlns:m="http://schemas.openxmlformats.org/officeDocument/2006/math" xmlns:v="urn:schemas-microsoft-com:vml" xmlns:wp14="http://schemas.microsoft.com/office/word/2010/wordprocessingDrawing" xmlns:wp="http://schemas.openxmlformats.org/drawingml/2006/wordprocessingDrawing" xmlns:w10="urn:schemas-microsoft-com:office:word" xmlns:w="http://schemas.openxmlformats.org/wordprocessingml/2006/main" xmlns:w14="http://schemas.microsoft.com/office/word/2010/wordml" xmlns:w15="http://schemas.microsoft.com/office/word/2012/wordml" xmlns:w16cex="http://schemas.microsoft.com/office/word/2018/wordml/cex" xmlns:w16cid="http://schemas.microsoft.com/office/word/2016/wordml/cid" xmlns:w16="http://schemas.microsoft.com/office/word/2018/wordml" xmlns:w16du="http://schemas.microsoft.com/office/word/2023/wordml/word16du" xmlns:w16sdtdh="http://schemas.microsoft.com/office/word/2020/wordml/sdtdatahash" xmlns:w16sdtfl="http://schemas.microsoft.com/office/word/2024/wordml/sdtformatlock" xmlns:w16se="http://schemas.microsoft.com/office/word/2015/wordml/symex" xmlns:wpg="http://schemas.microsoft.com/office/word/2010/wordprocessingGroup" xmlns:wpi="http://schemas.microsoft.com/office/word/2010/wordprocessingInk" xmlns:wne="http://schemas.microsoft.com/office/word/2006/wordml" xmlns:wps="http://schemas.microsoft.com/office/word/2010/wordprocessingShape" mc:Ignorable="w14 w15 w16se w16cid w16 w16cex w16sdtdh w16sdtfl w16du wp14">
+  <w:p>
+    <w:pPr>
+      <w:pStyle w:val="Encabezado"/>
+    </w:pPr>
+  </w:p>
+</w:hdr>
+</file>
+
+<file path=word/header2.xml><?xml version="1.0" encoding="utf-8"?>
+<w:hdr xmlns:wpc="http://schemas.microsoft.com/office/word/2010/wordprocessingCanvas" xmlns:cx="http://schemas.microsoft.com/office/drawing/2014/chartex" xmlns:cx1="http://schemas.microsoft.com/office/drawing/2015/9/8/chartex" xmlns:cx2="http://schemas.microsoft.com/office/drawing/2015/10/21/chartex" xmlns:cx3="http://schemas.microsoft.com/office/drawing/2016/5/9/chartex" xmlns:cx4="http://schemas.microsoft.com/office/drawing/2016/5/10/chartex" xmlns:cx5="http://schemas.microsoft.com/office/drawing/2016/5/11/chartex" xmlns:cx6="http://schemas.microsoft.com/office/drawing/2016/5/12/chartex" xmlns:cx7="http://schemas.microsoft.com/office/drawing/2016/5/13/chartex" xmlns:cx8="http://schemas.microsoft.com/office/drawing/2016/5/14/chartex" xmlns:mc="http://schemas.openxmlformats.org/markup-compatibility/2006" xmlns:aink="http://schemas.microsoft.com/office/drawing/2016/ink" xmlns:am3d="http://schemas.microsoft.com/office/drawing/2017/model3d" xmlns:o="urn:schemas-microsoft-com:office:office" xmlns:oel="http://schemas.microsoft.com/office/2019/extlst" xmlns:r="http://schemas.openxmlformats.org/officeDocument/2006/relationships" xmlns:m="http://schemas.openxmlformats.org/officeDocument/2006/math" xmlns:v="urn:schemas-microsoft-com:vml" xmlns:wp14="http://schemas.microsoft.com/office/word/2010/wordprocessingDrawing" xmlns:wp="http://schemas.openxmlformats.org/drawingml/2006/wordprocessingDrawing" xmlns:w10="urn:schemas-microsoft-com:office:word" xmlns:w="http://schemas.openxmlformats.org/wordprocessingml/2006/main" xmlns:w14="http://schemas.microsoft.com/office/word/2010/wordml" xmlns:w15="http://schemas.microsoft.com/office/word/2012/wordml" xmlns:w16cex="http://schemas.microsoft.com/office/word/2018/wordml/cex" xmlns:w16cid="http://schemas.microsoft.com/office/word/2016/wordml/cid" xmlns:w16="http://schemas.microsoft.com/office/word/2018/wordml" xmlns:w16du="http://schemas.microsoft.com/office/word/2023/wordml/word16du" xmlns:w16sdtdh="http://schemas.microsoft.com/office/word/2020/wordml/sdtdatahash" xmlns:w16sdtfl="http://schemas.microsoft.com/office/word/2024/wordml/sdtformatlock" xmlns:w16se="http://schemas.microsoft.com/office/word/2015/wordml/symex" xmlns:wpg="http://schemas.microsoft.com/office/word/2010/wordprocessingGroup" xmlns:wpi="http://schemas.microsoft.com/office/word/2010/wordprocessingInk" xmlns:wne="http://schemas.microsoft.com/office/word/2006/wordml" xmlns:wps="http://schemas.microsoft.com/office/word/2010/wordprocessingShape" mc:Ignorable="w14 w15 w16se w16cid w16 w16cex w16sdtdh w16sdtfl w16du wp14">
+  <w:p>
+    <w:pPr>
+      <w:pStyle w:val="Encabezado"/>
+    </w:pPr>
+  </w:p>
+</w:hdr>
+</file>
+
+<file path=word/header3.xml><?xml version="1.0" encoding="utf-8"?>
+<w:hdr xmlns:wpc="http://schemas.microsoft.com/office/word/2010/wordprocessingCanvas" xmlns:cx="http://schemas.microsoft.com/office/drawing/2014/chartex" xmlns:cx1="http://schemas.microsoft.com/office/drawing/2015/9/8/chartex" xmlns:cx2="http://schemas.microsoft.com/office/drawing/2015/10/21/chartex" xmlns:cx3="http://schemas.microsoft.com/office/drawing/2016/5/9/chartex" xmlns:cx4="http://schemas.microsoft.com/office/drawing/2016/5/10/chartex" xmlns:cx5="http://schemas.microsoft.com/office/drawing/2016/5/11/chartex" xmlns:cx6="http://schemas.microsoft.com/office/drawing/2016/5/12/chartex" xmlns:cx7="http://schemas.microsoft.com/office/drawing/2016/5/13/chartex" xmlns:cx8="http://schemas.microsoft.com/office/drawing/2016/5/14/chartex" xmlns:mc="http://schemas.openxmlformats.org/markup-compatibility/2006" xmlns:aink="http://schemas.microsoft.com/office/drawing/2016/ink" xmlns:am3d="http://schemas.microsoft.com/office/drawing/2017/model3d" xmlns:o="urn:schemas-microsoft-com:office:office" xmlns:oel="http://schemas.microsoft.com/office/2019/extlst" xmlns:r="http://schemas.openxmlformats.org/officeDocument/2006/relationships" xmlns:m="http://schemas.openxmlformats.org/officeDocument/2006/math" xmlns:v="urn:schemas-microsoft-com:vml" xmlns:wp14="http://schemas.microsoft.com/office/word/2010/wordprocessingDrawing" xmlns:wp="http://schemas.openxmlformats.org/drawingml/2006/wordprocessingDrawing" xmlns:w10="urn:schemas-microsoft-com:office:word" xmlns:w="http://schemas.openxmlformats.org/wordprocessingml/2006/main" xmlns:w14="http://schemas.microsoft.com/office/word/2010/wordml" xmlns:w15="http://schemas.microsoft.com/office/word/2012/wordml" xmlns:w16cex="http://schemas.microsoft.com/office/word/2018/wordml/cex" xmlns:w16cid="http://schemas.microsoft.com/office/word/2016/wordml/cid" xmlns:w16="http://schemas.microsoft.com/office/word/2018/wordml" xmlns:w16du="http://schemas.microsoft.com/office/word/2023/wordml/word16du" xmlns:w16sdtdh="http://schemas.microsoft.com/office/word/2020/wordml/sdtdatahash" xmlns:w16sdtfl="http://schemas.microsoft.com/office/word/2024/wordml/sdtformatlock" xmlns:w16se="http://schemas.microsoft.com/office/word/2015/wordml/symex" xmlns:wpg="http://schemas.microsoft.com/office/word/2010/wordprocessingGroup" xmlns:wpi="http://schemas.microsoft.com/office/word/2010/wordprocessingInk" xmlns:wne="http://schemas.microsoft.com/office/word/2006/wordml" xmlns:wps="http://schemas.microsoft.com/office/word/2010/wordprocessingShape" mc:Ignorable="w14 w15 w16se w16cid w16 w16cex w16sdtdh w16sdtfl w16du wp14">
+  <w:p>
+    <w:pPr>
+      <w:pStyle w:val="Encabezado"/>
+    </w:pPr>
+  </w:p>
+</w:hdr>
 </file>
 
 <file path=word/styles.xml><?xml version="1.0" encoding="utf-8"?>
@@ -7567,6 +8004,7 @@
   <w:style w:type="paragraph" w:styleId="Textoindependiente">
     <w:name w:val="Body Text"/>
     <w:basedOn w:val="Normal"/>
+    <w:link w:val="TextoindependienteCar"/>
     <w:uiPriority w:val="1"/>
     <w:qFormat/>
     <w:rPr>
@@ -7650,6 +8088,19 @@
     <w:rsid w:val="00013C19"/>
     <w:rPr>
       <w:rFonts w:ascii="Times New Roman" w:eastAsia="Times New Roman" w:hAnsi="Times New Roman" w:cs="Times New Roman"/>
+      <w:lang w:val="es-ES"/>
+    </w:rPr>
+  </w:style>
+  <w:style w:type="character" w:customStyle="1" w:styleId="TextoindependienteCar">
+    <w:name w:val="Texto independiente Car"/>
+    <w:basedOn w:val="Fuentedeprrafopredeter"/>
+    <w:link w:val="Textoindependiente"/>
+    <w:uiPriority w:val="1"/>
+    <w:rsid w:val="006241A3"/>
+    <w:rPr>
+      <w:rFonts w:ascii="Times New Roman" w:eastAsia="Times New Roman" w:hAnsi="Times New Roman" w:cs="Times New Roman"/>
+      <w:sz w:val="16"/>
+      <w:szCs w:val="16"/>
       <w:lang w:val="es-ES"/>
     </w:rPr>
   </w:style>

</xml_diff>